<commit_message>
Final version of report
</commit_message>
<xml_diff>
--- a/B0510011_Report.docx
+++ b/B0510011_Report.docx
@@ -10,6 +10,7 @@
         <w:rPr>
           <w:rFonts w:ascii="Times New Roman" w:hAnsi="Times New Roman" w:cs="Times New Roman"/>
           <w:sz w:val="24"/>
+          <w:lang w:val="ru-RU"/>
         </w:rPr>
       </w:pPr>
     </w:p>
@@ -236,7 +237,7 @@
       </w:pPr>
       <w:r>
         <w:rPr>
-          <w:rStyle w:val="a6"/>
+          <w:rStyle w:val="a7"/>
           <w:sz w:val="40"/>
           <w:szCs w:val="40"/>
           <w:lang w:val="en-US"/>
@@ -551,7 +552,27 @@
           <w:szCs w:val="24"/>
           <w:lang w:val="en-IN"/>
         </w:rPr>
-        <w:t>: 11.12.2025</w:t>
+        <w:t>: 1</w:t>
+      </w:r>
+      <w:r>
+        <w:rPr>
+          <w:rFonts w:ascii="Times New Roman" w:eastAsia="ArialMT" w:hAnsi="Times New Roman" w:cs="Times New Roman"/>
+          <w:color w:val="000000"/>
+          <w:sz w:val="24"/>
+          <w:szCs w:val="24"/>
+          <w:lang w:val="en-IN"/>
+        </w:rPr>
+        <w:t>2</w:t>
+      </w:r>
+      <w:r>
+        <w:rPr>
+          <w:rFonts w:ascii="Times New Roman" w:eastAsia="ArialMT" w:hAnsi="Times New Roman" w:cs="Times New Roman"/>
+          <w:color w:val="000000"/>
+          <w:sz w:val="24"/>
+          <w:szCs w:val="24"/>
+          <w:lang w:val="en-IN"/>
+        </w:rPr>
+        <w:t>.12.2025</w:t>
       </w:r>
     </w:p>
     <w:p>
@@ -1973,19 +1994,91 @@
         <w:spacing w:before="100" w:beforeAutospacing="1" w:after="100" w:afterAutospacing="1" w:line="240" w:lineRule="auto"/>
         <w:rPr>
           <w:rFonts w:ascii="Times New Roman" w:eastAsia="Times New Roman" w:hAnsi="Times New Roman" w:cs="Times New Roman"/>
-          <w:sz w:val="28"/>
-          <w:szCs w:val="28"/>
+          <w:sz w:val="24"/>
+          <w:szCs w:val="24"/>
           <w:lang w:eastAsia="ru-RU"/>
         </w:rPr>
       </w:pPr>
       <w:r>
         <w:rPr>
           <w:rFonts w:ascii="Times New Roman" w:eastAsia="Times New Roman" w:hAnsi="Times New Roman" w:cs="Times New Roman"/>
-          <w:sz w:val="28"/>
-          <w:szCs w:val="28"/>
+          <w:sz w:val="24"/>
+          <w:szCs w:val="24"/>
           <w:lang w:eastAsia="ru-RU"/>
         </w:rPr>
-        <w:t>Libraries often face difficulties when managing their book records manually. Paper-based logs can be lost or damaged, information is frequently recorded with mistakes, and finding a specific book becomes time-consuming. Manual tracking also makes it difficult to check whether a book is available or already borrowed by a member. As a result, the overall efficiency of the library decreases, and the quality of record-keeping becomes inconsistent.</w:t>
+        <w:t>Many challenges are encountered by libraries while</w:t>
+      </w:r>
+      <w:r>
+        <w:rPr>
+          <w:rFonts w:ascii="Times New Roman" w:hAnsi="Times New Roman" w:cs="Times New Roman"/>
+          <w:sz w:val="24"/>
+          <w:szCs w:val="24"/>
+          <w:lang w:val="ru-RU" w:eastAsia="ru-RU"/>
+        </w:rPr>
+        <w:t> </w:t>
+      </w:r>
+      <w:r>
+        <w:rPr>
+          <w:rFonts w:ascii="Times New Roman" w:eastAsia="Times New Roman" w:hAnsi="Times New Roman" w:cs="Times New Roman"/>
+          <w:sz w:val="24"/>
+          <w:szCs w:val="24"/>
+          <w:lang w:eastAsia="ru-RU"/>
+        </w:rPr>
+        <w:t>maintaining the record of their books manually. Logs on paper can</w:t>
+      </w:r>
+      <w:r>
+        <w:rPr>
+          <w:rFonts w:ascii="Times New Roman" w:hAnsi="Times New Roman" w:cs="Times New Roman"/>
+          <w:sz w:val="24"/>
+          <w:szCs w:val="24"/>
+          <w:lang w:val="ru-RU" w:eastAsia="ru-RU"/>
+        </w:rPr>
+        <w:t> </w:t>
+      </w:r>
+      <w:r>
+        <w:rPr>
+          <w:rFonts w:ascii="Times New Roman" w:eastAsia="Times New Roman" w:hAnsi="Times New Roman" w:cs="Times New Roman"/>
+          <w:sz w:val="24"/>
+          <w:szCs w:val="24"/>
+          <w:lang w:eastAsia="ru-RU"/>
+        </w:rPr>
+        <w:t>be lost or ruined, data is often written down incorrectly and looking for a book can take forever. It’s</w:t>
+      </w:r>
+      <w:r>
+        <w:rPr>
+          <w:rFonts w:ascii="Times New Roman" w:hAnsi="Times New Roman" w:cs="Times New Roman"/>
+          <w:sz w:val="24"/>
+          <w:szCs w:val="24"/>
+          <w:lang w:val="ru-RU" w:eastAsia="ru-RU"/>
+        </w:rPr>
+        <w:t> </w:t>
+      </w:r>
+      <w:r>
+        <w:rPr>
+          <w:rFonts w:ascii="Times New Roman" w:eastAsia="Times New Roman" w:hAnsi="Times New Roman" w:cs="Times New Roman"/>
+          <w:sz w:val="24"/>
+          <w:szCs w:val="24"/>
+          <w:lang w:eastAsia="ru-RU"/>
+        </w:rPr>
+        <w:t>hard to know which books are available or checked out by all members with manual tracking. So the general quality of the library</w:t>
+      </w:r>
+      <w:r>
+        <w:rPr>
+          <w:rFonts w:ascii="Times New Roman" w:hAnsi="Times New Roman" w:cs="Times New Roman"/>
+          <w:sz w:val="24"/>
+          <w:szCs w:val="24"/>
+          <w:lang w:val="ru-RU" w:eastAsia="ru-RU"/>
+        </w:rPr>
+        <w:t> </w:t>
+      </w:r>
+      <w:r>
+        <w:rPr>
+          <w:rFonts w:ascii="Times New Roman" w:eastAsia="Times New Roman" w:hAnsi="Times New Roman" w:cs="Times New Roman"/>
+          <w:sz w:val="24"/>
+          <w:szCs w:val="24"/>
+          <w:lang w:eastAsia="ru-RU"/>
+        </w:rPr>
+        <w:t>suffers and with it a poorly maintained record keeping.</w:t>
       </w:r>
     </w:p>
     <w:p>
@@ -1993,19 +2086,55 @@
         <w:spacing w:before="100" w:beforeAutospacing="1" w:after="100" w:afterAutospacing="1" w:line="240" w:lineRule="auto"/>
         <w:rPr>
           <w:rFonts w:ascii="Times New Roman" w:eastAsia="Times New Roman" w:hAnsi="Times New Roman" w:cs="Times New Roman"/>
-          <w:sz w:val="28"/>
-          <w:szCs w:val="28"/>
+          <w:sz w:val="24"/>
+          <w:szCs w:val="24"/>
           <w:lang w:eastAsia="ru-RU"/>
         </w:rPr>
       </w:pPr>
       <w:r>
         <w:rPr>
           <w:rFonts w:ascii="Times New Roman" w:eastAsia="Times New Roman" w:hAnsi="Times New Roman" w:cs="Times New Roman"/>
-          <w:sz w:val="28"/>
-          <w:szCs w:val="28"/>
+          <w:sz w:val="24"/>
+          <w:szCs w:val="24"/>
           <w:lang w:eastAsia="ru-RU"/>
         </w:rPr>
-        <w:t>To address these issues, a simple and reliable application is required to store book details, search for books by title, author, or ID, and manage borrowing and returning operations. Such a system reduces human error, speeds up routine tasks, and provides a more organized approach to maintaining a small or medium-sized library.</w:t>
+        <w:t>To resolve these problems, there is need for an easy to use and effective program that will keep track of book information, search books from the list by Title, Author or ID with</w:t>
+      </w:r>
+      <w:r>
+        <w:rPr>
+          <w:rFonts w:ascii="Times New Roman" w:hAnsi="Times New Roman" w:cs="Times New Roman"/>
+          <w:sz w:val="24"/>
+          <w:szCs w:val="24"/>
+          <w:lang w:val="ru-RU" w:eastAsia="ru-RU"/>
+        </w:rPr>
+        <w:t> </w:t>
+      </w:r>
+      <w:r>
+        <w:rPr>
+          <w:rFonts w:ascii="Times New Roman" w:eastAsia="Times New Roman" w:hAnsi="Times New Roman" w:cs="Times New Roman"/>
+          <w:sz w:val="24"/>
+          <w:szCs w:val="24"/>
+          <w:lang w:eastAsia="ru-RU"/>
+        </w:rPr>
+        <w:t>shortlisting functionality and handle borrow and return process. It can reduce human error, and make it easier for them to do their work with the library management on a routine basis, and there’s more</w:t>
+      </w:r>
+      <w:r>
+        <w:rPr>
+          <w:rFonts w:ascii="Times New Roman" w:hAnsi="Times New Roman" w:cs="Times New Roman"/>
+          <w:sz w:val="24"/>
+          <w:szCs w:val="24"/>
+          <w:lang w:val="ru-RU" w:eastAsia="ru-RU"/>
+        </w:rPr>
+        <w:t> </w:t>
+      </w:r>
+      <w:r>
+        <w:rPr>
+          <w:rFonts w:ascii="Times New Roman" w:eastAsia="Times New Roman" w:hAnsi="Times New Roman" w:cs="Times New Roman"/>
+          <w:sz w:val="24"/>
+          <w:szCs w:val="24"/>
+          <w:lang w:eastAsia="ru-RU"/>
+        </w:rPr>
+        <w:t>order in how you maintain a small to medium library.</w:t>
       </w:r>
     </w:p>
     <w:p>
@@ -2013,19 +2142,55 @@
         <w:spacing w:before="100" w:beforeAutospacing="1" w:after="100" w:afterAutospacing="1" w:line="240" w:lineRule="auto"/>
         <w:rPr>
           <w:rFonts w:ascii="Times New Roman" w:eastAsia="Times New Roman" w:hAnsi="Times New Roman" w:cs="Times New Roman"/>
-          <w:sz w:val="28"/>
-          <w:szCs w:val="28"/>
+          <w:sz w:val="24"/>
+          <w:szCs w:val="24"/>
           <w:lang w:eastAsia="ru-RU"/>
         </w:rPr>
       </w:pPr>
       <w:r>
         <w:rPr>
           <w:rFonts w:ascii="Times New Roman" w:eastAsia="Times New Roman" w:hAnsi="Times New Roman" w:cs="Times New Roman"/>
-          <w:sz w:val="28"/>
-          <w:szCs w:val="28"/>
+          <w:sz w:val="24"/>
+          <w:szCs w:val="24"/>
           <w:lang w:eastAsia="ru-RU"/>
         </w:rPr>
-        <w:t>The project developed for this purpose is a console-based Python application designed to manage a collection of books. It helps automate the basic operations of library maintenance and provides an easy-to-use interface suitable for both students and staff.</w:t>
+        <w:t>To do that I created,</w:t>
+      </w:r>
+      <w:r>
+        <w:rPr>
+          <w:rFonts w:ascii="Times New Roman" w:hAnsi="Times New Roman" w:cs="Times New Roman"/>
+          <w:sz w:val="24"/>
+          <w:szCs w:val="24"/>
+          <w:lang w:val="ru-RU" w:eastAsia="ru-RU"/>
+        </w:rPr>
+        <w:t> </w:t>
+      </w:r>
+      <w:r>
+        <w:rPr>
+          <w:rFonts w:ascii="Times New Roman" w:eastAsia="Times New Roman" w:hAnsi="Times New Roman" w:cs="Times New Roman"/>
+          <w:sz w:val="24"/>
+          <w:szCs w:val="24"/>
+          <w:lang w:eastAsia="ru-RU"/>
+        </w:rPr>
+        <w:t>as a support for this thesis, a console Python application to manage books. It automates the essential operations of a library such as maintenance,</w:t>
+      </w:r>
+      <w:r>
+        <w:rPr>
+          <w:rFonts w:ascii="Times New Roman" w:hAnsi="Times New Roman" w:cs="Times New Roman"/>
+          <w:sz w:val="24"/>
+          <w:szCs w:val="24"/>
+          <w:lang w:val="ru-RU" w:eastAsia="ru-RU"/>
+        </w:rPr>
+        <w:t> </w:t>
+      </w:r>
+      <w:r>
+        <w:rPr>
+          <w:rFonts w:ascii="Times New Roman" w:eastAsia="Times New Roman" w:hAnsi="Times New Roman" w:cs="Times New Roman"/>
+          <w:sz w:val="24"/>
+          <w:szCs w:val="24"/>
+          <w:lang w:eastAsia="ru-RU"/>
+        </w:rPr>
+        <w:t>access and easy way to professionals both for staff and students.</w:t>
       </w:r>
     </w:p>
     <w:p>
@@ -2167,11 +2332,25 @@
       <w:pPr>
         <w:pStyle w:val="1"/>
         <w:rPr>
-          <w:rStyle w:val="a6"/>
+          <w:rStyle w:val="a7"/>
           <w:b/>
           <w:bCs/>
           <w:sz w:val="28"/>
           <w:szCs w:val="28"/>
+          <w:lang w:val="en-US"/>
+        </w:rPr>
+      </w:pPr>
+    </w:p>
+    <w:p>
+      <w:pPr>
+        <w:pStyle w:val="1"/>
+        <w:rPr>
+          <w:rStyle w:val="a7"/>
+          <w:b/>
+          <w:bCs/>
+          <w:sz w:val="28"/>
+          <w:szCs w:val="28"/>
+          <w:lang w:val="en-US"/>
         </w:rPr>
       </w:pPr>
     </w:p>
@@ -2190,18 +2369,19 @@
       <w:proofErr w:type="spellStart"/>
       <w:r>
         <w:rPr>
-          <w:rStyle w:val="a6"/>
+          <w:rStyle w:val="a7"/>
           <w:b/>
           <w:bCs/>
           <w:sz w:val="28"/>
           <w:szCs w:val="28"/>
         </w:rPr>
+        <w:lastRenderedPageBreak/>
         <w:t>Requirement</w:t>
       </w:r>
       <w:proofErr w:type="spellEnd"/>
       <w:r>
         <w:rPr>
-          <w:rStyle w:val="a6"/>
+          <w:rStyle w:val="a7"/>
           <w:b/>
           <w:bCs/>
           <w:sz w:val="28"/>
@@ -2212,7 +2392,7 @@
       <w:proofErr w:type="spellStart"/>
       <w:r>
         <w:rPr>
-          <w:rStyle w:val="a6"/>
+          <w:rStyle w:val="a7"/>
           <w:b/>
           <w:bCs/>
           <w:sz w:val="28"/>
@@ -2228,11 +2408,375 @@
       </w:pPr>
       <w:r>
         <w:rPr>
-          <w:rStyle w:val="a6"/>
+          <w:rStyle w:val="a7"/>
           <w:b w:val="0"/>
           <w:bCs w:val="0"/>
         </w:rPr>
         <w:t>Functional Requirements</w:t>
+      </w:r>
+    </w:p>
+    <w:p>
+      <w:pPr>
+        <w:pStyle w:val="a3"/>
+        <w:numPr>
+          <w:ilvl w:val="0"/>
+          <w:numId w:val="26"/>
+        </w:numPr>
+        <w:spacing w:before="100" w:beforeAutospacing="1" w:after="100" w:afterAutospacing="1" w:line="240" w:lineRule="auto"/>
+        <w:rPr>
+          <w:rFonts w:ascii="Times New Roman" w:eastAsia="Times New Roman" w:hAnsi="Times New Roman" w:cs="Times New Roman"/>
+          <w:sz w:val="24"/>
+          <w:szCs w:val="24"/>
+          <w:lang w:eastAsia="ru-RU"/>
+        </w:rPr>
+      </w:pPr>
+      <w:r>
+        <w:rPr>
+          <w:rFonts w:ascii="Times New Roman" w:eastAsia="Times New Roman" w:hAnsi="Times New Roman" w:cs="Times New Roman"/>
+          <w:sz w:val="24"/>
+          <w:szCs w:val="24"/>
+          <w:lang w:eastAsia="ru-RU"/>
+        </w:rPr>
+        <w:t>The user should be able</w:t>
+      </w:r>
+      <w:r>
+        <w:rPr>
+          <w:rFonts w:ascii="Times New Roman" w:hAnsi="Times New Roman" w:cs="Times New Roman"/>
+          <w:sz w:val="24"/>
+          <w:szCs w:val="24"/>
+          <w:lang w:val="ru-RU" w:eastAsia="ru-RU"/>
+        </w:rPr>
+        <w:t> </w:t>
+      </w:r>
+      <w:r>
+        <w:rPr>
+          <w:rFonts w:ascii="Times New Roman" w:eastAsia="Times New Roman" w:hAnsi="Times New Roman" w:cs="Times New Roman"/>
+          <w:sz w:val="24"/>
+          <w:szCs w:val="24"/>
+          <w:lang w:eastAsia="ru-RU"/>
+        </w:rPr>
+        <w:t>to add new book records to the library database, consisting of at least id, title, author, and year published.</w:t>
+      </w:r>
+    </w:p>
+    <w:p>
+      <w:pPr>
+        <w:pStyle w:val="a3"/>
+        <w:numPr>
+          <w:ilvl w:val="0"/>
+          <w:numId w:val="26"/>
+        </w:numPr>
+        <w:spacing w:before="100" w:beforeAutospacing="1" w:after="100" w:afterAutospacing="1" w:line="240" w:lineRule="auto"/>
+        <w:rPr>
+          <w:rFonts w:ascii="Times New Roman" w:eastAsia="Times New Roman" w:hAnsi="Times New Roman" w:cs="Times New Roman"/>
+          <w:sz w:val="24"/>
+          <w:szCs w:val="24"/>
+          <w:lang w:eastAsia="ru-RU"/>
+        </w:rPr>
+      </w:pPr>
+      <w:r>
+        <w:rPr>
+          <w:rFonts w:ascii="Times New Roman" w:eastAsia="Times New Roman" w:hAnsi="Times New Roman" w:cs="Times New Roman"/>
+          <w:sz w:val="24"/>
+          <w:szCs w:val="24"/>
+          <w:lang w:eastAsia="ru-RU"/>
+        </w:rPr>
+        <w:t>There should be</w:t>
+      </w:r>
+      <w:r>
+        <w:rPr>
+          <w:rFonts w:ascii="Times New Roman" w:hAnsi="Times New Roman" w:cs="Times New Roman"/>
+          <w:sz w:val="24"/>
+          <w:szCs w:val="24"/>
+          <w:lang w:val="ru-RU" w:eastAsia="ru-RU"/>
+        </w:rPr>
+        <w:t> </w:t>
+      </w:r>
+      <w:r>
+        <w:rPr>
+          <w:rFonts w:ascii="Times New Roman" w:eastAsia="Times New Roman" w:hAnsi="Times New Roman" w:cs="Times New Roman"/>
+          <w:sz w:val="24"/>
+          <w:szCs w:val="24"/>
+          <w:lang w:eastAsia="ru-RU"/>
+        </w:rPr>
+        <w:t>a way to remove a book from the catalog if it is not being borrowed.</w:t>
+      </w:r>
+    </w:p>
+    <w:p>
+      <w:pPr>
+        <w:pStyle w:val="a3"/>
+        <w:numPr>
+          <w:ilvl w:val="0"/>
+          <w:numId w:val="26"/>
+        </w:numPr>
+        <w:spacing w:before="100" w:beforeAutospacing="1" w:after="100" w:afterAutospacing="1" w:line="240" w:lineRule="auto"/>
+        <w:rPr>
+          <w:rFonts w:ascii="Times New Roman" w:eastAsia="Times New Roman" w:hAnsi="Times New Roman" w:cs="Times New Roman"/>
+          <w:sz w:val="24"/>
+          <w:szCs w:val="24"/>
+          <w:lang w:eastAsia="ru-RU"/>
+        </w:rPr>
+      </w:pPr>
+      <w:r>
+        <w:rPr>
+          <w:rFonts w:ascii="Times New Roman" w:eastAsia="Times New Roman" w:hAnsi="Times New Roman" w:cs="Times New Roman"/>
+          <w:sz w:val="24"/>
+          <w:szCs w:val="24"/>
+          <w:lang w:eastAsia="ru-RU"/>
+        </w:rPr>
+        <w:t>The system should support searching for books by</w:t>
+      </w:r>
+      <w:r>
+        <w:rPr>
+          <w:rFonts w:ascii="Times New Roman" w:hAnsi="Times New Roman" w:cs="Times New Roman"/>
+          <w:sz w:val="24"/>
+          <w:szCs w:val="24"/>
+          <w:lang w:val="ru-RU" w:eastAsia="ru-RU"/>
+        </w:rPr>
+        <w:t> </w:t>
+      </w:r>
+      <w:r>
+        <w:rPr>
+          <w:rFonts w:ascii="Times New Roman" w:eastAsia="Times New Roman" w:hAnsi="Times New Roman" w:cs="Times New Roman"/>
+          <w:sz w:val="24"/>
+          <w:szCs w:val="24"/>
+          <w:lang w:eastAsia="ru-RU"/>
+        </w:rPr>
+        <w:t>id, title or author.</w:t>
+      </w:r>
+    </w:p>
+    <w:p>
+      <w:pPr>
+        <w:pStyle w:val="a3"/>
+        <w:numPr>
+          <w:ilvl w:val="0"/>
+          <w:numId w:val="26"/>
+        </w:numPr>
+        <w:spacing w:before="100" w:beforeAutospacing="1" w:after="100" w:afterAutospacing="1" w:line="240" w:lineRule="auto"/>
+        <w:rPr>
+          <w:rFonts w:ascii="Times New Roman" w:eastAsia="Times New Roman" w:hAnsi="Times New Roman" w:cs="Times New Roman"/>
+          <w:sz w:val="24"/>
+          <w:szCs w:val="24"/>
+          <w:lang w:eastAsia="ru-RU"/>
+        </w:rPr>
+      </w:pPr>
+      <w:r>
+        <w:rPr>
+          <w:rFonts w:ascii="Times New Roman" w:eastAsia="Times New Roman" w:hAnsi="Times New Roman" w:cs="Times New Roman"/>
+          <w:sz w:val="24"/>
+          <w:szCs w:val="24"/>
+          <w:lang w:eastAsia="ru-RU"/>
+        </w:rPr>
+        <w:t>The system should be able to show all</w:t>
+      </w:r>
+      <w:r>
+        <w:rPr>
+          <w:rFonts w:ascii="Times New Roman" w:hAnsi="Times New Roman" w:cs="Times New Roman"/>
+          <w:sz w:val="24"/>
+          <w:szCs w:val="24"/>
+          <w:lang w:val="ru-RU" w:eastAsia="ru-RU"/>
+        </w:rPr>
+        <w:t> </w:t>
+      </w:r>
+      <w:r>
+        <w:rPr>
+          <w:rFonts w:ascii="Times New Roman" w:eastAsia="Times New Roman" w:hAnsi="Times New Roman" w:cs="Times New Roman"/>
+          <w:sz w:val="24"/>
+          <w:szCs w:val="24"/>
+          <w:lang w:eastAsia="ru-RU"/>
+        </w:rPr>
+        <w:t>of a Book’s details like book name, author, publisher etc. from the database.</w:t>
+      </w:r>
+    </w:p>
+    <w:p>
+      <w:pPr>
+        <w:pStyle w:val="a3"/>
+        <w:numPr>
+          <w:ilvl w:val="0"/>
+          <w:numId w:val="26"/>
+        </w:numPr>
+        <w:spacing w:before="100" w:beforeAutospacing="1" w:after="100" w:afterAutospacing="1" w:line="240" w:lineRule="auto"/>
+        <w:rPr>
+          <w:rFonts w:ascii="Times New Roman" w:eastAsia="Times New Roman" w:hAnsi="Times New Roman" w:cs="Times New Roman"/>
+          <w:sz w:val="24"/>
+          <w:szCs w:val="24"/>
+          <w:lang w:eastAsia="ru-RU"/>
+        </w:rPr>
+      </w:pPr>
+      <w:r>
+        <w:rPr>
+          <w:rFonts w:ascii="Times New Roman" w:eastAsia="Times New Roman" w:hAnsi="Times New Roman" w:cs="Times New Roman"/>
+          <w:sz w:val="24"/>
+          <w:szCs w:val="24"/>
+          <w:lang w:eastAsia="ru-RU"/>
+        </w:rPr>
+        <w:t>The customers should be registered and the system will allow members to borrow books and return the</w:t>
+      </w:r>
+      <w:r>
+        <w:rPr>
+          <w:rFonts w:ascii="Times New Roman" w:hAnsi="Times New Roman" w:cs="Times New Roman"/>
+          <w:sz w:val="24"/>
+          <w:szCs w:val="24"/>
+          <w:lang w:val="ru-RU" w:eastAsia="ru-RU"/>
+        </w:rPr>
+        <w:t> </w:t>
+      </w:r>
+      <w:r>
+        <w:rPr>
+          <w:rFonts w:ascii="Times New Roman" w:eastAsia="Times New Roman" w:hAnsi="Times New Roman" w:cs="Times New Roman"/>
+          <w:sz w:val="24"/>
+          <w:szCs w:val="24"/>
+          <w:lang w:eastAsia="ru-RU"/>
+        </w:rPr>
+        <w:t>same.</w:t>
+      </w:r>
+    </w:p>
+    <w:p>
+      <w:pPr>
+        <w:pStyle w:val="a3"/>
+        <w:numPr>
+          <w:ilvl w:val="0"/>
+          <w:numId w:val="26"/>
+        </w:numPr>
+        <w:spacing w:before="100" w:beforeAutospacing="1" w:after="100" w:afterAutospacing="1" w:line="240" w:lineRule="auto"/>
+        <w:rPr>
+          <w:rFonts w:ascii="Times New Roman" w:eastAsia="Times New Roman" w:hAnsi="Times New Roman" w:cs="Times New Roman"/>
+          <w:sz w:val="24"/>
+          <w:szCs w:val="24"/>
+          <w:lang w:eastAsia="ru-RU"/>
+        </w:rPr>
+      </w:pPr>
+      <w:r>
+        <w:rPr>
+          <w:rFonts w:ascii="Times New Roman" w:eastAsia="Times New Roman" w:hAnsi="Times New Roman" w:cs="Times New Roman"/>
+          <w:sz w:val="24"/>
+          <w:szCs w:val="24"/>
+          <w:lang w:eastAsia="ru-RU"/>
+        </w:rPr>
+        <w:t>The system should</w:t>
+      </w:r>
+      <w:r>
+        <w:rPr>
+          <w:rFonts w:ascii="Times New Roman" w:hAnsi="Times New Roman" w:cs="Times New Roman"/>
+          <w:sz w:val="24"/>
+          <w:szCs w:val="24"/>
+          <w:lang w:val="ru-RU" w:eastAsia="ru-RU"/>
+        </w:rPr>
+        <w:t> </w:t>
+      </w:r>
+      <w:r>
+        <w:rPr>
+          <w:rFonts w:ascii="Times New Roman" w:eastAsia="Times New Roman" w:hAnsi="Times New Roman" w:cs="Times New Roman"/>
+          <w:sz w:val="24"/>
+          <w:szCs w:val="24"/>
+          <w:lang w:eastAsia="ru-RU"/>
+        </w:rPr>
+        <w:t>also support for returning of the books which were issued before and updating that too.</w:t>
+      </w:r>
+    </w:p>
+    <w:p>
+      <w:pPr>
+        <w:pStyle w:val="a3"/>
+        <w:numPr>
+          <w:ilvl w:val="0"/>
+          <w:numId w:val="26"/>
+        </w:numPr>
+        <w:spacing w:before="100" w:beforeAutospacing="1" w:after="100" w:afterAutospacing="1" w:line="240" w:lineRule="auto"/>
+        <w:rPr>
+          <w:rFonts w:ascii="Times New Roman" w:eastAsia="Times New Roman" w:hAnsi="Times New Roman" w:cs="Times New Roman"/>
+          <w:sz w:val="24"/>
+          <w:szCs w:val="24"/>
+          <w:lang w:eastAsia="ru-RU"/>
+        </w:rPr>
+      </w:pPr>
+      <w:r>
+        <w:rPr>
+          <w:rFonts w:ascii="Times New Roman" w:eastAsia="Times New Roman" w:hAnsi="Times New Roman" w:cs="Times New Roman"/>
+          <w:sz w:val="24"/>
+          <w:szCs w:val="24"/>
+          <w:lang w:eastAsia="ru-RU"/>
+        </w:rPr>
+        <w:t>All of the book</w:t>
+      </w:r>
+      <w:r>
+        <w:rPr>
+          <w:rFonts w:ascii="Times New Roman" w:hAnsi="Times New Roman" w:cs="Times New Roman"/>
+          <w:sz w:val="24"/>
+          <w:szCs w:val="24"/>
+          <w:lang w:val="ru-RU" w:eastAsia="ru-RU"/>
+        </w:rPr>
+        <w:t> </w:t>
+      </w:r>
+      <w:r>
+        <w:rPr>
+          <w:rFonts w:ascii="Times New Roman" w:eastAsia="Times New Roman" w:hAnsi="Times New Roman" w:cs="Times New Roman"/>
+          <w:sz w:val="24"/>
+          <w:szCs w:val="24"/>
+          <w:lang w:eastAsia="ru-RU"/>
+        </w:rPr>
+        <w:t>and member data will need to be stored in an external file so you do not lose information between sessions.</w:t>
+      </w:r>
+    </w:p>
+    <w:p>
+      <w:pPr>
+        <w:pStyle w:val="a3"/>
+        <w:numPr>
+          <w:ilvl w:val="0"/>
+          <w:numId w:val="26"/>
+        </w:numPr>
+        <w:spacing w:before="100" w:beforeAutospacing="1" w:after="100" w:afterAutospacing="1" w:line="240" w:lineRule="auto"/>
+        <w:rPr>
+          <w:rFonts w:ascii="Times New Roman" w:eastAsia="Times New Roman" w:hAnsi="Times New Roman" w:cs="Times New Roman"/>
+          <w:sz w:val="24"/>
+          <w:szCs w:val="24"/>
+          <w:lang w:eastAsia="ru-RU"/>
+        </w:rPr>
+      </w:pPr>
+      <w:r>
+        <w:rPr>
+          <w:rFonts w:ascii="Times New Roman" w:eastAsia="Times New Roman" w:hAnsi="Times New Roman" w:cs="Times New Roman"/>
+          <w:sz w:val="24"/>
+          <w:szCs w:val="24"/>
+          <w:lang w:eastAsia="ru-RU"/>
+        </w:rPr>
+        <w:t>the program should</w:t>
+      </w:r>
+      <w:r>
+        <w:rPr>
+          <w:rFonts w:ascii="Times New Roman" w:hAnsi="Times New Roman" w:cs="Times New Roman"/>
+          <w:sz w:val="24"/>
+          <w:szCs w:val="24"/>
+          <w:lang w:val="ru-RU" w:eastAsia="ru-RU"/>
+        </w:rPr>
+        <w:t> </w:t>
+      </w:r>
+      <w:r>
+        <w:rPr>
+          <w:rFonts w:ascii="Times New Roman" w:eastAsia="Times New Roman" w:hAnsi="Times New Roman" w:cs="Times New Roman"/>
+          <w:sz w:val="24"/>
+          <w:szCs w:val="24"/>
+          <w:lang w:eastAsia="ru-RU"/>
+        </w:rPr>
+        <w:t>read data from file by itself when it starts.</w:t>
+      </w:r>
+    </w:p>
+    <w:p>
+      <w:r>
+        <w:pict w14:anchorId="0FAC5A3A">
+          <v:rect id="_x0000_i1025" style="width:0;height:1.5pt" o:hralign="center" o:hrstd="t" o:hr="t" fillcolor="#a0a0a0" stroked="f"/>
+        </w:pict>
+      </w:r>
+    </w:p>
+    <w:p>
+      <w:pPr>
+        <w:pStyle w:val="3"/>
+      </w:pPr>
+      <w:r>
+        <w:rPr>
+          <w:rStyle w:val="a7"/>
+          <w:b w:val="0"/>
+          <w:bCs w:val="0"/>
+        </w:rPr>
+        <w:t>Non-Functional Requirements</w:t>
       </w:r>
     </w:p>
     <w:p>
@@ -2240,7 +2784,7 @@
         <w:pStyle w:val="a5"/>
         <w:numPr>
           <w:ilvl w:val="0"/>
-          <w:numId w:val="5"/>
+          <w:numId w:val="27"/>
         </w:numPr>
         <w:rPr>
           <w:lang w:val="en-US"/>
@@ -2250,7 +2794,16 @@
         <w:rPr>
           <w:lang w:val="en-US"/>
         </w:rPr>
-        <w:t>The system must allow the user to add new books to the library database, including details such as ID, title, author, and year of publication.</w:t>
+        <w:t>Simple and user-friendly console interface of the</w:t>
+      </w:r>
+      <w:r>
+        <w:t> </w:t>
+      </w:r>
+      <w:r>
+        <w:rPr>
+          <w:lang w:val="en-US"/>
+        </w:rPr>
+        <w:t>system.</w:t>
       </w:r>
     </w:p>
     <w:p>
@@ -2258,7 +2811,7 @@
         <w:pStyle w:val="a5"/>
         <w:numPr>
           <w:ilvl w:val="0"/>
-          <w:numId w:val="5"/>
+          <w:numId w:val="27"/>
         </w:numPr>
         <w:rPr>
           <w:lang w:val="en-US"/>
@@ -2268,7 +2821,16 @@
         <w:rPr>
           <w:lang w:val="en-US"/>
         </w:rPr>
-        <w:t>The system must allow the user to remove a book from the catalog if it is not currently borrowed.</w:t>
+        <w:t>Validation should be enforced</w:t>
+      </w:r>
+      <w:r>
+        <w:t> </w:t>
+      </w:r>
+      <w:r>
+        <w:rPr>
+          <w:lang w:val="en-US"/>
+        </w:rPr>
+        <w:t>to ensure that incorrect or incomplete data has not been entered.</w:t>
       </w:r>
     </w:p>
     <w:p>
@@ -2276,7 +2838,7 @@
         <w:pStyle w:val="a5"/>
         <w:numPr>
           <w:ilvl w:val="0"/>
-          <w:numId w:val="5"/>
+          <w:numId w:val="27"/>
         </w:numPr>
         <w:rPr>
           <w:lang w:val="en-US"/>
@@ -2286,7 +2848,16 @@
         <w:rPr>
           <w:lang w:val="en-US"/>
         </w:rPr>
-        <w:t>The system must provide a search function that allows users to find books by ID, title, or author.</w:t>
+        <w:t>The application must provide a snappy response to</w:t>
+      </w:r>
+      <w:r>
+        <w:t> </w:t>
+      </w:r>
+      <w:r>
+        <w:rPr>
+          <w:lang w:val="en-US"/>
+        </w:rPr>
+        <w:t>the users' actions with no (or very small) perceived lag.</w:t>
       </w:r>
     </w:p>
     <w:p>
@@ -2294,7 +2865,7 @@
         <w:pStyle w:val="a5"/>
         <w:numPr>
           <w:ilvl w:val="0"/>
-          <w:numId w:val="5"/>
+          <w:numId w:val="27"/>
         </w:numPr>
         <w:rPr>
           <w:lang w:val="en-US"/>
@@ -2304,7 +2875,16 @@
         <w:rPr>
           <w:lang w:val="en-US"/>
         </w:rPr>
-        <w:t>The system must display a full list of all books stored in the library.</w:t>
+        <w:t>The code should be constructed using</w:t>
+      </w:r>
+      <w:r>
+        <w:t> </w:t>
+      </w:r>
+      <w:r>
+        <w:rPr>
+          <w:lang w:val="en-US"/>
+        </w:rPr>
+        <w:t>the structure of object-oriented programming like Classes, Objects, Constructor and Encapsulation.</w:t>
       </w:r>
     </w:p>
     <w:p>
@@ -2312,7 +2892,7 @@
         <w:pStyle w:val="a5"/>
         <w:numPr>
           <w:ilvl w:val="0"/>
-          <w:numId w:val="5"/>
+          <w:numId w:val="27"/>
         </w:numPr>
         <w:rPr>
           <w:lang w:val="en-US"/>
@@ -2322,7 +2902,16 @@
         <w:rPr>
           <w:lang w:val="en-US"/>
         </w:rPr>
-        <w:t>The system must allow borrowing of books by registered members and update their availability status.</w:t>
+        <w:t>And the system should be easily modifiable and extendible in</w:t>
+      </w:r>
+      <w:r>
+        <w:t> </w:t>
+      </w:r>
+      <w:r>
+        <w:rPr>
+          <w:lang w:val="en-US"/>
+        </w:rPr>
+        <w:t>future (e.g. adding new features or swapping the storage- way).</w:t>
       </w:r>
     </w:p>
     <w:p>
@@ -2330,7 +2919,7 @@
         <w:pStyle w:val="a5"/>
         <w:numPr>
           <w:ilvl w:val="0"/>
-          <w:numId w:val="5"/>
+          <w:numId w:val="27"/>
         </w:numPr>
         <w:rPr>
           <w:lang w:val="en-US"/>
@@ -2340,171 +2929,16 @@
         <w:rPr>
           <w:lang w:val="en-US"/>
         </w:rPr>
-        <w:t>The system must allow returning of borrowed books and update the corresponding records.</w:t>
-      </w:r>
-    </w:p>
-    <w:p>
-      <w:pPr>
-        <w:pStyle w:val="a5"/>
-        <w:numPr>
-          <w:ilvl w:val="0"/>
-          <w:numId w:val="5"/>
-        </w:numPr>
-        <w:rPr>
-          <w:lang w:val="en-US"/>
-        </w:rPr>
-      </w:pPr>
-      <w:r>
-        <w:rPr>
-          <w:lang w:val="en-US"/>
-        </w:rPr>
-        <w:t>The system must store all book and member data in an external file so that information is preserved between sessions.</w:t>
-      </w:r>
-    </w:p>
-    <w:p>
-      <w:pPr>
-        <w:pStyle w:val="a5"/>
-        <w:numPr>
-          <w:ilvl w:val="0"/>
-          <w:numId w:val="5"/>
-        </w:numPr>
-        <w:rPr>
-          <w:lang w:val="en-US"/>
-        </w:rPr>
-      </w:pPr>
-      <w:r>
-        <w:rPr>
-          <w:lang w:val="en-US"/>
-        </w:rPr>
-        <w:t>The system must load data from the file automatically when the program starts.</w:t>
-      </w:r>
-    </w:p>
-    <w:p>
-      <w:r>
-        <w:pict w14:anchorId="0FAC5A3A">
-          <v:rect id="_x0000_i1025" style="width:0;height:1.5pt" o:hralign="center" o:hrstd="t" o:hr="t" fillcolor="#a0a0a0" stroked="f"/>
-        </w:pict>
-      </w:r>
-    </w:p>
-    <w:p>
-      <w:pPr>
-        <w:pStyle w:val="3"/>
-      </w:pPr>
-      <w:r>
-        <w:rPr>
-          <w:rStyle w:val="a6"/>
-          <w:b w:val="0"/>
-          <w:bCs w:val="0"/>
-        </w:rPr>
-        <w:t>Non-Functional Requirements</w:t>
-      </w:r>
-    </w:p>
-    <w:p>
-      <w:pPr>
-        <w:pStyle w:val="a5"/>
-        <w:numPr>
-          <w:ilvl w:val="0"/>
-          <w:numId w:val="6"/>
-        </w:numPr>
-        <w:rPr>
-          <w:lang w:val="en-US"/>
-        </w:rPr>
-      </w:pPr>
-      <w:r>
-        <w:rPr>
-          <w:lang w:val="en-US"/>
-        </w:rPr>
-        <w:t>The system should have a simple and user-friendly console interface.</w:t>
-      </w:r>
-    </w:p>
-    <w:p>
-      <w:pPr>
-        <w:pStyle w:val="a5"/>
-        <w:numPr>
-          <w:ilvl w:val="0"/>
-          <w:numId w:val="6"/>
-        </w:numPr>
-        <w:rPr>
-          <w:lang w:val="en-US"/>
-        </w:rPr>
-      </w:pPr>
-      <w:r>
-        <w:rPr>
-          <w:lang w:val="en-US"/>
-        </w:rPr>
-        <w:t>Input validation must be implemented to prevent incorrect or incomplete data from being entered.</w:t>
-      </w:r>
-    </w:p>
-    <w:p>
-      <w:pPr>
-        <w:pStyle w:val="a5"/>
-        <w:numPr>
-          <w:ilvl w:val="0"/>
-          <w:numId w:val="6"/>
-        </w:numPr>
-        <w:rPr>
-          <w:lang w:val="en-US"/>
-        </w:rPr>
-      </w:pPr>
-      <w:r>
-        <w:rPr>
-          <w:lang w:val="en-US"/>
-        </w:rPr>
-        <w:t>The program should respond quickly to user actions without noticeable delays.</w:t>
-      </w:r>
-    </w:p>
-    <w:p>
-      <w:pPr>
-        <w:pStyle w:val="a5"/>
-        <w:numPr>
-          <w:ilvl w:val="0"/>
-          <w:numId w:val="6"/>
-        </w:numPr>
-        <w:rPr>
-          <w:lang w:val="en-US"/>
-        </w:rPr>
-      </w:pPr>
-      <w:r>
-        <w:rPr>
-          <w:lang w:val="en-US"/>
-        </w:rPr>
-        <w:t>The structure of the code should follow object-oriented programming principles such as classes, objects, constructors, and encapsulation.</w:t>
-      </w:r>
-    </w:p>
-    <w:p>
-      <w:pPr>
-        <w:pStyle w:val="a5"/>
-        <w:numPr>
-          <w:ilvl w:val="0"/>
-          <w:numId w:val="6"/>
-        </w:numPr>
-        <w:rPr>
-          <w:lang w:val="en-US"/>
-        </w:rPr>
-      </w:pPr>
-      <w:r>
-        <w:rPr>
-          <w:lang w:val="en-US"/>
-        </w:rPr>
-        <w:t>The system should be easy to modify or extend in the future (for example, adding new features or replacing the storage method).</w:t>
-      </w:r>
-    </w:p>
-    <w:p>
-      <w:pPr>
-        <w:pStyle w:val="a5"/>
-        <w:numPr>
-          <w:ilvl w:val="0"/>
-          <w:numId w:val="6"/>
-        </w:numPr>
-        <w:rPr>
-          <w:lang w:val="en-US"/>
-        </w:rPr>
-      </w:pPr>
-      <w:r>
-        <w:rPr>
-          <w:lang w:val="en-US"/>
-        </w:rPr>
-        <w:t>The program should run on any device that supports Python 3.9 or higher.</w:t>
+        <w:t>This program is supposed to work on any device which uses Python version</w:t>
+      </w:r>
+      <w:r>
+        <w:t> </w:t>
+      </w:r>
+      <w:r>
+        <w:rPr>
+          <w:lang w:val="en-US"/>
+        </w:rPr>
+        <w:t>3.9 and above.</w:t>
       </w:r>
     </w:p>
     <w:p>
@@ -2565,7 +2999,7 @@
       <w:pPr>
         <w:pStyle w:val="1"/>
         <w:rPr>
-          <w:rStyle w:val="a6"/>
+          <w:rStyle w:val="a7"/>
           <w:b/>
           <w:bCs/>
           <w:sz w:val="28"/>
@@ -2578,7 +3012,7 @@
       <w:pPr>
         <w:pStyle w:val="1"/>
         <w:rPr>
-          <w:rStyle w:val="a6"/>
+          <w:rStyle w:val="a7"/>
           <w:b/>
           <w:bCs/>
           <w:sz w:val="28"/>
@@ -2591,7 +3025,7 @@
       <w:pPr>
         <w:pStyle w:val="1"/>
         <w:rPr>
-          <w:rStyle w:val="a6"/>
+          <w:rStyle w:val="a7"/>
           <w:b/>
           <w:bCs/>
           <w:sz w:val="28"/>
@@ -2611,7 +3045,7 @@
       </w:pPr>
       <w:r>
         <w:rPr>
-          <w:rStyle w:val="a6"/>
+          <w:rStyle w:val="a7"/>
           <w:b/>
           <w:bCs/>
           <w:sz w:val="28"/>
@@ -2622,7 +3056,7 @@
       </w:r>
       <w:r>
         <w:rPr>
-          <w:rStyle w:val="a6"/>
+          <w:rStyle w:val="a7"/>
           <w:b/>
           <w:bCs/>
           <w:sz w:val="28"/>
@@ -2638,7 +3072,7 @@
       </w:pPr>
       <w:r>
         <w:rPr>
-          <w:rStyle w:val="a6"/>
+          <w:rStyle w:val="a7"/>
           <w:b w:val="0"/>
           <w:bCs w:val="0"/>
         </w:rPr>
@@ -2656,7 +3090,31 @@
         <w:rPr>
           <w:lang w:val="en-US"/>
         </w:rPr>
-        <w:t>The application uses a simple console-based menu that allows the user to navigate through different operations. The menu appears each time after an action is completed.</w:t>
+        <w:t>Simple text menu provided by the application that</w:t>
+      </w:r>
+      <w:r>
+        <w:t> </w:t>
+      </w:r>
+      <w:r>
+        <w:rPr>
+          <w:lang w:val="en-US"/>
+        </w:rPr>
+        <w:t xml:space="preserve">allows users to browse through various operation. </w:t>
+      </w:r>
+      <w:r>
+        <w:rPr>
+          <w:lang w:val="en-US"/>
+        </w:rPr>
+        <w:t>The menu pops up after each</w:t>
+      </w:r>
+      <w:r>
+        <w:t> </w:t>
+      </w:r>
+      <w:r>
+        <w:rPr>
+          <w:lang w:val="en-US"/>
+        </w:rPr>
+        <w:t>action.</w:t>
       </w:r>
     </w:p>
     <w:p>
@@ -2912,18 +3370,51 @@
           <w:lang w:val="en-US"/>
         </w:rPr>
       </w:pPr>
-      <w:r>
-        <w:rPr>
-          <w:lang w:val="en-US"/>
-        </w:rPr>
-        <w:t>The user selects an option by entering the corresponding number.</w:t>
-      </w:r>
-      <w:r>
-        <w:rPr>
-          <w:lang w:val="en-US"/>
-        </w:rPr>
-        <w:br/>
-        <w:t>Input validation ensures that incorrect choices do not cause the program to crash.</w:t>
+    </w:p>
+    <w:p>
+      <w:pPr>
+        <w:pStyle w:val="a5"/>
+        <w:rPr>
+          <w:lang w:val="en-US"/>
+        </w:rPr>
+      </w:pPr>
+      <w:r>
+        <w:rPr>
+          <w:lang w:val="en-US"/>
+        </w:rPr>
+        <w:t>The</w:t>
+      </w:r>
+      <w:r>
+        <w:t> </w:t>
+      </w:r>
+      <w:r>
+        <w:rPr>
+          <w:lang w:val="en-US"/>
+        </w:rPr>
+        <w:t>user enters a number to select an option.</w:t>
+      </w:r>
+    </w:p>
+    <w:p>
+      <w:pPr>
+        <w:pStyle w:val="a5"/>
+        <w:rPr>
+          <w:lang w:val="en-US"/>
+        </w:rPr>
+      </w:pPr>
+      <w:r>
+        <w:rPr>
+          <w:lang w:val="en-US"/>
+        </w:rPr>
+        <w:t>Input</w:t>
+      </w:r>
+      <w:r>
+        <w:t> </w:t>
+      </w:r>
+      <w:r>
+        <w:rPr>
+          <w:lang w:val="en-US"/>
+        </w:rPr>
+        <w:t>validation prevents wrong input from crashing the program.</w:t>
       </w:r>
     </w:p>
     <w:p>
@@ -2932,7 +3423,7 @@
       </w:pPr>
       <w:r>
         <w:rPr>
-          <w:rStyle w:val="a6"/>
+          <w:rStyle w:val="a7"/>
           <w:b w:val="0"/>
           <w:bCs w:val="0"/>
         </w:rPr>
@@ -3890,6 +4381,7 @@
           <w:rStyle w:val="HTML1"/>
           <w:lang w:val="en-US"/>
         </w:rPr>
+        <w:lastRenderedPageBreak/>
         <w:t xml:space="preserve">                  </w:t>
       </w:r>
       <w:r>
@@ -3934,11 +4426,10 @@
       </w:pPr>
       <w:r>
         <w:rPr>
-          <w:rStyle w:val="a6"/>
+          <w:rStyle w:val="a7"/>
           <w:b w:val="0"/>
           <w:bCs w:val="0"/>
         </w:rPr>
-        <w:lastRenderedPageBreak/>
         <w:t>3. User Interaction Overview</w:t>
       </w:r>
     </w:p>
@@ -3947,7 +4438,7 @@
         <w:pStyle w:val="a5"/>
         <w:numPr>
           <w:ilvl w:val="0"/>
-          <w:numId w:val="7"/>
+          <w:numId w:val="29"/>
         </w:numPr>
         <w:rPr>
           <w:lang w:val="en-US"/>
@@ -3957,7 +4448,7 @@
         <w:rPr>
           <w:lang w:val="en-US"/>
         </w:rPr>
-        <w:t>The user always starts from the main menu.</w:t>
+        <w:t>The user begins from the main menu at all times.</w:t>
       </w:r>
     </w:p>
     <w:p>
@@ -3965,7 +4456,7 @@
         <w:pStyle w:val="a5"/>
         <w:numPr>
           <w:ilvl w:val="0"/>
-          <w:numId w:val="7"/>
+          <w:numId w:val="29"/>
         </w:numPr>
         <w:rPr>
           <w:lang w:val="en-US"/>
@@ -3975,7 +4466,16 @@
         <w:rPr>
           <w:lang w:val="en-US"/>
         </w:rPr>
-        <w:t>After choosing an operation, the system requests the necessary input (e.g., book ID, title).</w:t>
+        <w:t>There is</w:t>
+      </w:r>
+      <w:r>
+        <w:t> </w:t>
+      </w:r>
+      <w:r>
+        <w:rPr>
+          <w:lang w:val="en-US"/>
+        </w:rPr>
+        <w:t>a prompt for required input (e.g., book ID, title) after any selection has occurred.</w:t>
       </w:r>
     </w:p>
     <w:p>
@@ -3983,7 +4483,7 @@
         <w:pStyle w:val="a5"/>
         <w:numPr>
           <w:ilvl w:val="0"/>
-          <w:numId w:val="7"/>
+          <w:numId w:val="29"/>
         </w:numPr>
         <w:rPr>
           <w:lang w:val="en-US"/>
@@ -3993,7 +4493,16 @@
         <w:rPr>
           <w:lang w:val="en-US"/>
         </w:rPr>
-        <w:t>When the operation is completed, a confirmation message is shown.</w:t>
+        <w:t>Once</w:t>
+      </w:r>
+      <w:r>
+        <w:t> </w:t>
+      </w:r>
+      <w:r>
+        <w:rPr>
+          <w:lang w:val="en-US"/>
+        </w:rPr>
+        <w:t>operation is done, a prompt message pops up.</w:t>
       </w:r>
     </w:p>
     <w:p>
@@ -4001,7 +4510,7 @@
         <w:pStyle w:val="a5"/>
         <w:numPr>
           <w:ilvl w:val="0"/>
-          <w:numId w:val="7"/>
+          <w:numId w:val="29"/>
         </w:numPr>
         <w:rPr>
           <w:lang w:val="en-US"/>
@@ -4011,20 +4520,16 @@
         <w:rPr>
           <w:lang w:val="en-US"/>
         </w:rPr>
-        <w:t xml:space="preserve">The user is returned to the main menu until they choose option </w:t>
-      </w:r>
-      <w:r>
-        <w:rPr>
-          <w:rStyle w:val="a6"/>
-          <w:lang w:val="en-US"/>
-        </w:rPr>
-        <w:t>0</w:t>
-      </w:r>
-      <w:r>
-        <w:rPr>
-          <w:lang w:val="en-US"/>
-        </w:rPr>
-        <w:t xml:space="preserve"> to exit the program.</w:t>
+        <w:t>The</w:t>
+      </w:r>
+      <w:r>
+        <w:t> </w:t>
+      </w:r>
+      <w:r>
+        <w:rPr>
+          <w:lang w:val="en-US"/>
+        </w:rPr>
+        <w:t>user is brought back to the main menu until option 0 (to exit the program) is selected.</w:t>
       </w:r>
     </w:p>
     <w:p>
@@ -4274,7 +4779,7 @@
       <w:pPr>
         <w:pStyle w:val="1"/>
         <w:rPr>
-          <w:rStyle w:val="a6"/>
+          <w:rStyle w:val="a7"/>
           <w:b/>
           <w:bCs/>
           <w:sz w:val="28"/>
@@ -4294,7 +4799,7 @@
       </w:pPr>
       <w:r>
         <w:rPr>
-          <w:rStyle w:val="a6"/>
+          <w:rStyle w:val="a7"/>
           <w:b/>
           <w:bCs/>
           <w:sz w:val="28"/>
@@ -4305,7 +4810,7 @@
       </w:r>
       <w:r>
         <w:rPr>
-          <w:rStyle w:val="a6"/>
+          <w:rStyle w:val="a7"/>
           <w:b/>
           <w:bCs/>
           <w:sz w:val="28"/>
@@ -4326,7 +4831,25 @@
         <w:rPr>
           <w:lang w:val="en-US"/>
         </w:rPr>
-        <w:t>The scope of this project is limited to implementing a basic library management system that handles essential operations needed for maintaining a small book collection. The application focuses on providing the following core features:</w:t>
+        <w:t>Limitation The system function includes all the basic operation required to manage</w:t>
+      </w:r>
+      <w:r>
+        <w:t> </w:t>
+      </w:r>
+      <w:r>
+        <w:rPr>
+          <w:lang w:val="en-US"/>
+        </w:rPr>
+        <w:t>a small size library collection. As such the app concentrates on</w:t>
+      </w:r>
+      <w:r>
+        <w:t> </w:t>
+      </w:r>
+      <w:r>
+        <w:rPr>
+          <w:lang w:val="en-US"/>
+        </w:rPr>
+        <w:t>providing the following basic features:</w:t>
       </w:r>
     </w:p>
     <w:p>
@@ -4335,7 +4858,7 @@
       </w:pPr>
       <w:r>
         <w:rPr>
-          <w:rStyle w:val="a6"/>
+          <w:rStyle w:val="a7"/>
           <w:b w:val="0"/>
           <w:bCs w:val="0"/>
         </w:rPr>
@@ -4357,7 +4880,16 @@
         <w:rPr>
           <w:lang w:val="en-US"/>
         </w:rPr>
-        <w:t>Adding new books to the library.</w:t>
+        <w:t>Bringing new books</w:t>
+      </w:r>
+      <w:r>
+        <w:t> </w:t>
+      </w:r>
+      <w:r>
+        <w:rPr>
+          <w:lang w:val="en-US"/>
+        </w:rPr>
+        <w:t>to the library.</w:t>
       </w:r>
     </w:p>
     <w:p>
@@ -4375,7 +4907,16 @@
         <w:rPr>
           <w:lang w:val="en-US"/>
         </w:rPr>
-        <w:t>Removing existing books that are not currently borrowed.</w:t>
+        <w:t>Delete books that are not borrowed yet in the</w:t>
+      </w:r>
+      <w:r>
+        <w:t> </w:t>
+      </w:r>
+      <w:r>
+        <w:rPr>
+          <w:lang w:val="en-US"/>
+        </w:rPr>
+        <w:t>collection.</w:t>
       </w:r>
     </w:p>
     <w:p>
@@ -4393,7 +4934,16 @@
         <w:rPr>
           <w:lang w:val="en-US"/>
         </w:rPr>
-        <w:t>Searching for books by ID, title, or author.</w:t>
+        <w:t>Finding books by its ID,</w:t>
+      </w:r>
+      <w:r>
+        <w:t> </w:t>
+      </w:r>
+      <w:r>
+        <w:rPr>
+          <w:lang w:val="en-US"/>
+        </w:rPr>
+        <w:t>title or author.</w:t>
       </w:r>
     </w:p>
     <w:p>
@@ -4411,7 +4961,16 @@
         <w:rPr>
           <w:lang w:val="en-US"/>
         </w:rPr>
-        <w:t>Displaying a complete list of all books stored in the system.</w:t>
+        <w:t>That</w:t>
+      </w:r>
+      <w:r>
+        <w:t> </w:t>
+      </w:r>
+      <w:r>
+        <w:rPr>
+          <w:lang w:val="en-US"/>
+        </w:rPr>
+        <w:t>will list all of the books within your system.</w:t>
       </w:r>
     </w:p>
     <w:p>
@@ -4429,7 +4988,16 @@
         <w:rPr>
           <w:lang w:val="en-US"/>
         </w:rPr>
-        <w:t>Managing registered members of the library.</w:t>
+        <w:t>Maintaining the membership</w:t>
+      </w:r>
+      <w:r>
+        <w:t> </w:t>
+      </w:r>
+      <w:r>
+        <w:rPr>
+          <w:lang w:val="en-US"/>
+        </w:rPr>
+        <w:t>of library patrons.</w:t>
       </w:r>
     </w:p>
     <w:p>
@@ -4447,7 +5015,16 @@
         <w:rPr>
           <w:lang w:val="en-US"/>
         </w:rPr>
-        <w:t>Borrowing and returning books with status updates.</w:t>
+        <w:t>Checking out and in books with</w:t>
+      </w:r>
+      <w:r>
+        <w:t> </w:t>
+      </w:r>
+      <w:r>
+        <w:rPr>
+          <w:lang w:val="en-US"/>
+        </w:rPr>
+        <w:t>status updates.</w:t>
       </w:r>
     </w:p>
     <w:p>
@@ -4465,7 +5042,16 @@
         <w:rPr>
           <w:lang w:val="en-US"/>
         </w:rPr>
-        <w:t>Saving and loading all data from an external JSON file.</w:t>
+        <w:t>You</w:t>
+      </w:r>
+      <w:r>
+        <w:t> </w:t>
+      </w:r>
+      <w:r>
+        <w:rPr>
+          <w:lang w:val="en-US"/>
+        </w:rPr>
+        <w:t>should use save and load to (from a file) all your data into a JSON file.</w:t>
       </w:r>
     </w:p>
     <w:p>
@@ -4483,7 +5069,16 @@
         <w:rPr>
           <w:lang w:val="en-US"/>
         </w:rPr>
-        <w:t>Validating user input to prevent errors.</w:t>
+        <w:t>Verifying user input</w:t>
+      </w:r>
+      <w:r>
+        <w:t> </w:t>
+      </w:r>
+      <w:r>
+        <w:rPr>
+          <w:lang w:val="en-US"/>
+        </w:rPr>
+        <w:t>to avoid mistakes.</w:t>
       </w:r>
     </w:p>
     <w:p>
@@ -4492,7 +5087,7 @@
       </w:pPr>
       <w:r>
         <w:rPr>
-          <w:rStyle w:val="a6"/>
+          <w:rStyle w:val="a7"/>
           <w:b w:val="0"/>
           <w:bCs w:val="0"/>
         </w:rPr>
@@ -4521,8 +5116,13 @@
           <w:numId w:val="9"/>
         </w:numPr>
       </w:pPr>
-      <w:r>
-        <w:t>Graphical User Interface (GUI).</w:t>
+      <w:proofErr w:type="spellStart"/>
+      <w:r>
+        <w:t>Graphical</w:t>
+      </w:r>
+      <w:proofErr w:type="spellEnd"/>
+      <w:r>
+        <w:t xml:space="preserve"> User Interface (GUI).</w:t>
       </w:r>
     </w:p>
     <w:p>
@@ -4588,7 +5188,31 @@
         </w:numPr>
       </w:pPr>
       <w:r>
-        <w:t>Advanced reporting or analytics.</w:t>
+        <w:t xml:space="preserve">Advanced </w:t>
+      </w:r>
+      <w:proofErr w:type="spellStart"/>
+      <w:r>
+        <w:t>reporting</w:t>
+      </w:r>
+      <w:proofErr w:type="spellEnd"/>
+      <w:r>
+        <w:t xml:space="preserve"> </w:t>
+      </w:r>
+      <w:proofErr w:type="spellStart"/>
+      <w:r>
+        <w:t>or</w:t>
+      </w:r>
+      <w:proofErr w:type="spellEnd"/>
+      <w:r>
+        <w:t xml:space="preserve"> </w:t>
+      </w:r>
+      <w:proofErr w:type="spellStart"/>
+      <w:r>
+        <w:t>analytics</w:t>
+      </w:r>
+      <w:proofErr w:type="spellEnd"/>
+      <w:r>
+        <w:t>.</w:t>
       </w:r>
     </w:p>
     <w:p>
@@ -4717,7 +5341,7 @@
       <w:pPr>
         <w:pStyle w:val="1"/>
         <w:rPr>
-          <w:rStyle w:val="a6"/>
+          <w:rStyle w:val="a7"/>
           <w:b/>
           <w:bCs/>
           <w:sz w:val="28"/>
@@ -4735,7 +5359,7 @@
       </w:pPr>
       <w:r>
         <w:rPr>
-          <w:rStyle w:val="a6"/>
+          <w:rStyle w:val="a7"/>
           <w:b/>
           <w:bCs/>
           <w:sz w:val="28"/>
@@ -4746,7 +5370,7 @@
       </w:r>
       <w:r>
         <w:rPr>
-          <w:rStyle w:val="a6"/>
+          <w:rStyle w:val="a7"/>
           <w:b/>
           <w:bCs/>
           <w:sz w:val="28"/>
@@ -4767,28 +5391,58 @@
         <w:rPr>
           <w:lang w:val="en-US"/>
         </w:rPr>
-        <w:t xml:space="preserve">The Library Management System was developed using Python and follows the principles of object-oriented programming. The program is organized into three main files: </w:t>
-      </w:r>
-      <w:r>
-        <w:rPr>
-          <w:rStyle w:val="HTML1"/>
-          <w:lang w:val="en-US"/>
-        </w:rPr>
-        <w:t>models.py</w:t>
-      </w:r>
-      <w:r>
-        <w:rPr>
-          <w:lang w:val="en-US"/>
-        </w:rPr>
-        <w:t xml:space="preserve">, </w:t>
-      </w:r>
-      <w:r>
-        <w:rPr>
-          <w:rStyle w:val="HTML1"/>
-          <w:lang w:val="en-US"/>
-        </w:rPr>
-        <w:t>library.py</w:t>
-      </w:r>
+        <w:t>The system is implemented using Python, and it</w:t>
+      </w:r>
+      <w:r>
+        <w:t> </w:t>
+      </w:r>
+      <w:r>
+        <w:rPr>
+          <w:lang w:val="en-US"/>
+        </w:rPr>
+        <w:t>adheres to famous object-oriented practices. The content of the program is divided into three main</w:t>
+      </w:r>
+      <w:r>
+        <w:t> </w:t>
+      </w:r>
+      <w:r>
+        <w:rPr>
+          <w:lang w:val="en-US"/>
+        </w:rPr>
+        <w:t xml:space="preserve">files: </w:t>
+      </w:r>
+      <w:r>
+        <w:rPr>
+          <w:rStyle w:val="ab"/>
+          <w:lang w:val="en-US"/>
+        </w:rPr>
+        <w:t xml:space="preserve">models. </w:t>
+      </w:r>
+      <w:proofErr w:type="spellStart"/>
+      <w:r>
+        <w:rPr>
+          <w:rStyle w:val="ab"/>
+          <w:lang w:val="en-US"/>
+        </w:rPr>
+        <w:t>py</w:t>
+      </w:r>
+      <w:proofErr w:type="spellEnd"/>
+      <w:r>
+        <w:rPr>
+          <w:rStyle w:val="ab"/>
+          <w:lang w:val="en-US"/>
+        </w:rPr>
+        <w:t xml:space="preserve">, library. </w:t>
+      </w:r>
+      <w:proofErr w:type="spellStart"/>
+      <w:r>
+        <w:rPr>
+          <w:rStyle w:val="ab"/>
+          <w:lang w:val="en-US"/>
+        </w:rPr>
+        <w:t>py</w:t>
+      </w:r>
+      <w:proofErr w:type="spellEnd"/>
       <w:r>
         <w:rPr>
           <w:lang w:val="en-US"/>
@@ -4797,17 +5451,43 @@
       </w:r>
       <w:r>
         <w:rPr>
-          <w:rStyle w:val="HTML1"/>
-          <w:lang w:val="en-US"/>
-        </w:rPr>
-        <w:t>main.py</w:t>
-      </w:r>
-      <w:r>
-        <w:rPr>
-          <w:lang w:val="en-US"/>
-        </w:rPr>
-        <w:t>. Each file contains a specific part of the system logic, making the application modular, readable, and easy to maintain.</w:t>
-      </w:r>
+          <w:rStyle w:val="ab"/>
+          <w:lang w:val="en-US"/>
+        </w:rPr>
+        <w:t xml:space="preserve">main. </w:t>
+      </w:r>
+      <w:proofErr w:type="spellStart"/>
+      <w:r>
+        <w:rPr>
+          <w:rStyle w:val="ab"/>
+          <w:lang w:val="en-US"/>
+        </w:rPr>
+        <w:t>py</w:t>
+      </w:r>
+      <w:proofErr w:type="spellEnd"/>
+      <w:r>
+        <w:rPr>
+          <w:lang w:val="en-US"/>
+        </w:rPr>
+        <w:t>. Each file takes care of a different system logic</w:t>
+      </w:r>
+      <w:r>
+        <w:t> </w:t>
+      </w:r>
+      <w:r>
+        <w:rPr>
+          <w:lang w:val="en-US"/>
+        </w:rPr>
+        <w:t>we need, making the application modular and easy to read/maintain.</w:t>
+      </w:r>
+    </w:p>
+    <w:p>
+      <w:pPr>
+        <w:pStyle w:val="a5"/>
+        <w:rPr>
+          <w:lang w:val="en-US"/>
+        </w:rPr>
+      </w:pPr>
     </w:p>
     <w:p>
       <w:r>
@@ -4822,7 +5502,7 @@
       </w:pPr>
       <w:r>
         <w:rPr>
-          <w:rStyle w:val="a6"/>
+          <w:rStyle w:val="a7"/>
           <w:b w:val="0"/>
           <w:bCs w:val="0"/>
         </w:rPr>
@@ -4888,7 +5568,7 @@
       </w:pPr>
       <w:r>
         <w:rPr>
-          <w:rStyle w:val="a6"/>
+          <w:rStyle w:val="a7"/>
           <w:b w:val="0"/>
           <w:bCs w:val="0"/>
         </w:rPr>
@@ -4925,7 +5605,15 @@
         <w:br/>
       </w:r>
       <w:r>
-        <w:t>It includes:</w:t>
+        <w:t xml:space="preserve">It </w:t>
+      </w:r>
+      <w:proofErr w:type="spellStart"/>
+      <w:r>
+        <w:t>includes</w:t>
+      </w:r>
+      <w:proofErr w:type="spellEnd"/>
+      <w:r>
+        <w:t>:</w:t>
       </w:r>
     </w:p>
     <w:p>
@@ -4937,8 +5625,13 @@
         </w:numPr>
       </w:pPr>
       <w:r>
-        <w:t>Book attributes</w:t>
-      </w:r>
+        <w:t xml:space="preserve">Book </w:t>
+      </w:r>
+      <w:proofErr w:type="spellStart"/>
+      <w:r>
+        <w:t>attributes</w:t>
+      </w:r>
+      <w:proofErr w:type="spellEnd"/>
     </w:p>
     <w:p>
       <w:pPr>
@@ -4996,7 +5689,7 @@
       </w:pPr>
       <w:r>
         <w:rPr>
-          <w:rStyle w:val="a6"/>
+          <w:rStyle w:val="a7"/>
           <w:b w:val="0"/>
           <w:bCs w:val="0"/>
         </w:rPr>
@@ -5033,7 +5726,15 @@
         <w:br/>
       </w:r>
       <w:r>
-        <w:t>It stores:</w:t>
+        <w:t xml:space="preserve">It </w:t>
+      </w:r>
+      <w:proofErr w:type="spellStart"/>
+      <w:r>
+        <w:t>stores</w:t>
+      </w:r>
+      <w:proofErr w:type="spellEnd"/>
+      <w:r>
+        <w:t>:</w:t>
       </w:r>
     </w:p>
     <w:p>
@@ -5044,8 +5745,13 @@
           <w:numId w:val="11"/>
         </w:numPr>
       </w:pPr>
-      <w:r>
-        <w:t>Member ID</w:t>
+      <w:proofErr w:type="spellStart"/>
+      <w:r>
+        <w:t>Member</w:t>
+      </w:r>
+      <w:proofErr w:type="spellEnd"/>
+      <w:r>
+        <w:t xml:space="preserve"> ID</w:t>
       </w:r>
     </w:p>
     <w:p>
@@ -5056,9 +5762,19 @@
           <w:numId w:val="11"/>
         </w:numPr>
       </w:pPr>
-      <w:r>
-        <w:t>Member name</w:t>
-      </w:r>
+      <w:proofErr w:type="spellStart"/>
+      <w:r>
+        <w:t>Member</w:t>
+      </w:r>
+      <w:proofErr w:type="spellEnd"/>
+      <w:r>
+        <w:t xml:space="preserve"> </w:t>
+      </w:r>
+      <w:proofErr w:type="spellStart"/>
+      <w:r>
+        <w:t>name</w:t>
+      </w:r>
+      <w:proofErr w:type="spellEnd"/>
     </w:p>
     <w:p>
       <w:pPr>
@@ -5098,10 +5814,11 @@
       </w:pPr>
       <w:r>
         <w:rPr>
-          <w:rStyle w:val="a6"/>
+          <w:rStyle w:val="a7"/>
           <w:b w:val="0"/>
           <w:bCs w:val="0"/>
         </w:rPr>
+        <w:lastRenderedPageBreak/>
         <w:t>Library Class</w:t>
       </w:r>
     </w:p>
@@ -5135,7 +5852,15 @@
         <w:br/>
       </w:r>
       <w:r>
-        <w:t>It contains:</w:t>
+        <w:t xml:space="preserve">It </w:t>
+      </w:r>
+      <w:proofErr w:type="spellStart"/>
+      <w:r>
+        <w:t>contains</w:t>
+      </w:r>
+      <w:proofErr w:type="spellEnd"/>
+      <w:r>
+        <w:t>:</w:t>
       </w:r>
     </w:p>
     <w:p>
@@ -5147,8 +5872,37 @@
         </w:numPr>
       </w:pPr>
       <w:r>
-        <w:t>A list of all books</w:t>
-      </w:r>
+        <w:t xml:space="preserve">A </w:t>
+      </w:r>
+      <w:proofErr w:type="spellStart"/>
+      <w:r>
+        <w:t>list</w:t>
+      </w:r>
+      <w:proofErr w:type="spellEnd"/>
+      <w:r>
+        <w:t xml:space="preserve"> </w:t>
+      </w:r>
+      <w:proofErr w:type="spellStart"/>
+      <w:r>
+        <w:t>of</w:t>
+      </w:r>
+      <w:proofErr w:type="spellEnd"/>
+      <w:r>
+        <w:t xml:space="preserve"> </w:t>
+      </w:r>
+      <w:proofErr w:type="spellStart"/>
+      <w:r>
+        <w:t>all</w:t>
+      </w:r>
+      <w:proofErr w:type="spellEnd"/>
+      <w:r>
+        <w:t xml:space="preserve"> </w:t>
+      </w:r>
+      <w:proofErr w:type="spellStart"/>
+      <w:r>
+        <w:t>books</w:t>
+      </w:r>
+      <w:proofErr w:type="spellEnd"/>
     </w:p>
     <w:p>
       <w:pPr>
@@ -5159,8 +5913,37 @@
         </w:numPr>
       </w:pPr>
       <w:r>
-        <w:t>A list of all members</w:t>
-      </w:r>
+        <w:t xml:space="preserve">A </w:t>
+      </w:r>
+      <w:proofErr w:type="spellStart"/>
+      <w:r>
+        <w:t>list</w:t>
+      </w:r>
+      <w:proofErr w:type="spellEnd"/>
+      <w:r>
+        <w:t xml:space="preserve"> </w:t>
+      </w:r>
+      <w:proofErr w:type="spellStart"/>
+      <w:r>
+        <w:t>of</w:t>
+      </w:r>
+      <w:proofErr w:type="spellEnd"/>
+      <w:r>
+        <w:t xml:space="preserve"> </w:t>
+      </w:r>
+      <w:proofErr w:type="spellStart"/>
+      <w:r>
+        <w:t>all</w:t>
+      </w:r>
+      <w:proofErr w:type="spellEnd"/>
+      <w:r>
+        <w:t xml:space="preserve"> </w:t>
+      </w:r>
+      <w:proofErr w:type="spellStart"/>
+      <w:r>
+        <w:t>members</w:t>
+      </w:r>
+      <w:proofErr w:type="spellEnd"/>
     </w:p>
     <w:p>
       <w:pPr>
@@ -5177,7 +5960,6 @@
         <w:rPr>
           <w:lang w:val="en-US"/>
         </w:rPr>
-        <w:lastRenderedPageBreak/>
         <w:t>Methods for adding, removing, searching, borrowing, and returning books</w:t>
       </w:r>
     </w:p>
@@ -5226,7 +6008,7 @@
       </w:pPr>
       <w:r>
         <w:rPr>
-          <w:rStyle w:val="a6"/>
+          <w:rStyle w:val="a7"/>
           <w:b w:val="0"/>
           <w:bCs w:val="0"/>
         </w:rPr>
@@ -5359,6 +6141,7 @@
           <w:lang w:val="en-US"/>
         </w:rPr>
       </w:pPr>
+      <w:proofErr w:type="spellStart"/>
       <w:r>
         <w:rPr>
           <w:rStyle w:val="hljs-keyword"/>
@@ -5371,7 +6154,15 @@
           <w:rStyle w:val="HTML1"/>
           <w:lang w:val="en-US"/>
         </w:rPr>
-        <w:t xml:space="preserve">.json     → stores saved </w:t>
+        <w:t>.json</w:t>
+      </w:r>
+      <w:proofErr w:type="spellEnd"/>
+      <w:r>
+        <w:rPr>
+          <w:rStyle w:val="HTML1"/>
+          <w:lang w:val="en-US"/>
+        </w:rPr>
+        <w:t xml:space="preserve">     → stores saved </w:t>
       </w:r>
       <w:r>
         <w:rPr>
@@ -5386,6 +6177,73 @@
           <w:lang w:val="en-US"/>
         </w:rPr>
         <w:t xml:space="preserve"> (created automatically)</w:t>
+      </w:r>
+    </w:p>
+    <w:p>
+      <w:pPr>
+        <w:pStyle w:val="HTML"/>
+        <w:rPr>
+          <w:rStyle w:val="HTML1"/>
+          <w:lang w:val="en-US"/>
+        </w:rPr>
+      </w:pPr>
+    </w:p>
+    <w:p>
+      <w:pPr>
+        <w:pStyle w:val="HTML"/>
+        <w:rPr>
+          <w:rStyle w:val="HTML1"/>
+          <w:lang w:val="en-US"/>
+        </w:rPr>
+      </w:pPr>
+      <w:r>
+        <w:rPr>
+          <w:rStyle w:val="HTML1"/>
+          <w:noProof/>
+          <w:lang w:val="en-US"/>
+        </w:rPr>
+        <w:drawing>
+          <wp:inline distT="0" distB="0" distL="0" distR="0" wp14:anchorId="41927A24" wp14:editId="61678C98">
+            <wp:extent cx="4381018" cy="3929380"/>
+            <wp:effectExtent l="0" t="0" r="635" b="0"/>
+            <wp:docPr id="1" name="Рисунок 1"/>
+            <wp:cNvGraphicFramePr>
+              <a:graphicFrameLocks xmlns:a="http://schemas.openxmlformats.org/drawingml/2006/main" noChangeAspect="1"/>
+            </wp:cNvGraphicFramePr>
+            <a:graphic xmlns:a="http://schemas.openxmlformats.org/drawingml/2006/main">
+              <a:graphicData uri="http://schemas.openxmlformats.org/drawingml/2006/picture">
+                <pic:pic xmlns:pic="http://schemas.openxmlformats.org/drawingml/2006/picture">
+                  <pic:nvPicPr>
+                    <pic:cNvPr id="1" name=""/>
+                    <pic:cNvPicPr/>
+                  </pic:nvPicPr>
+                  <pic:blipFill>
+                    <a:blip r:embed="rId6"/>
+                    <a:stretch>
+                      <a:fillRect/>
+                    </a:stretch>
+                  </pic:blipFill>
+                  <pic:spPr>
+                    <a:xfrm>
+                      <a:off x="0" y="0"/>
+                      <a:ext cx="4391060" cy="3938387"/>
+                    </a:xfrm>
+                    <a:prstGeom prst="rect">
+                      <a:avLst/>
+                    </a:prstGeom>
+                  </pic:spPr>
+                </pic:pic>
+              </a:graphicData>
+            </a:graphic>
+          </wp:inline>
+        </w:drawing>
+      </w:r>
+      <w:r>
+        <w:rPr>
+          <w:rStyle w:val="HTML1"/>
+          <w:lang w:val="en-US"/>
+        </w:rPr>
+        <w:t xml:space="preserve"> </w:t>
       </w:r>
     </w:p>
     <w:p>
@@ -5412,13 +6270,33 @@
     <w:p>
       <w:pPr>
         <w:pStyle w:val="3"/>
-      </w:pPr>
-      <w:r>
-        <w:rPr>
-          <w:rStyle w:val="a6"/>
+        <w:rPr>
+          <w:rStyle w:val="a7"/>
           <w:b w:val="0"/>
           <w:bCs w:val="0"/>
         </w:rPr>
+      </w:pPr>
+    </w:p>
+    <w:p>
+      <w:pPr>
+        <w:pStyle w:val="3"/>
+        <w:rPr>
+          <w:rStyle w:val="a7"/>
+          <w:b w:val="0"/>
+          <w:bCs w:val="0"/>
+        </w:rPr>
+      </w:pPr>
+    </w:p>
+    <w:p>
+      <w:pPr>
+        <w:pStyle w:val="3"/>
+      </w:pPr>
+      <w:r>
+        <w:rPr>
+          <w:rStyle w:val="a7"/>
+          <w:b w:val="0"/>
+          <w:bCs w:val="0"/>
+        </w:rPr>
         <w:t>3. Data Storage</w:t>
       </w:r>
     </w:p>
@@ -5435,6 +6313,7 @@
         </w:rPr>
         <w:t xml:space="preserve">All data is stored in </w:t>
       </w:r>
+      <w:proofErr w:type="spellStart"/>
       <w:r>
         <w:rPr>
           <w:rStyle w:val="HTML1"/>
@@ -5442,6 +6321,7 @@
         </w:rPr>
         <w:t>data.json</w:t>
       </w:r>
+      <w:proofErr w:type="spellEnd"/>
       <w:r>
         <w:rPr>
           <w:lang w:val="en-US"/>
@@ -5465,8 +6345,29 @@
         </w:numPr>
       </w:pPr>
       <w:r>
-        <w:t>The list of books</w:t>
-      </w:r>
+        <w:t xml:space="preserve">The </w:t>
+      </w:r>
+      <w:proofErr w:type="spellStart"/>
+      <w:r>
+        <w:t>list</w:t>
+      </w:r>
+      <w:proofErr w:type="spellEnd"/>
+      <w:r>
+        <w:t xml:space="preserve"> </w:t>
+      </w:r>
+      <w:proofErr w:type="spellStart"/>
+      <w:r>
+        <w:t>of</w:t>
+      </w:r>
+      <w:proofErr w:type="spellEnd"/>
+      <w:r>
+        <w:t xml:space="preserve"> </w:t>
+      </w:r>
+      <w:proofErr w:type="spellStart"/>
+      <w:r>
+        <w:t>books</w:t>
+      </w:r>
+      <w:proofErr w:type="spellEnd"/>
     </w:p>
     <w:p>
       <w:pPr>
@@ -5477,8 +6378,37 @@
         </w:numPr>
       </w:pPr>
       <w:r>
-        <w:t>The list of library members</w:t>
-      </w:r>
+        <w:t xml:space="preserve">The </w:t>
+      </w:r>
+      <w:proofErr w:type="spellStart"/>
+      <w:r>
+        <w:t>list</w:t>
+      </w:r>
+      <w:proofErr w:type="spellEnd"/>
+      <w:r>
+        <w:t xml:space="preserve"> </w:t>
+      </w:r>
+      <w:proofErr w:type="spellStart"/>
+      <w:r>
+        <w:t>of</w:t>
+      </w:r>
+      <w:proofErr w:type="spellEnd"/>
+      <w:r>
+        <w:t xml:space="preserve"> </w:t>
+      </w:r>
+      <w:proofErr w:type="spellStart"/>
+      <w:r>
+        <w:t>library</w:t>
+      </w:r>
+      <w:proofErr w:type="spellEnd"/>
+      <w:r>
+        <w:t xml:space="preserve"> </w:t>
+      </w:r>
+      <w:proofErr w:type="spellStart"/>
+      <w:r>
+        <w:t>members</w:t>
+      </w:r>
+      <w:proofErr w:type="spellEnd"/>
     </w:p>
     <w:p>
       <w:pPr>
@@ -5489,8 +6419,37 @@
         </w:numPr>
       </w:pPr>
       <w:r>
-        <w:t>Book availability and borrower information</w:t>
-      </w:r>
+        <w:t xml:space="preserve">Book </w:t>
+      </w:r>
+      <w:proofErr w:type="spellStart"/>
+      <w:r>
+        <w:t>availability</w:t>
+      </w:r>
+      <w:proofErr w:type="spellEnd"/>
+      <w:r>
+        <w:t xml:space="preserve"> </w:t>
+      </w:r>
+      <w:proofErr w:type="spellStart"/>
+      <w:r>
+        <w:t>and</w:t>
+      </w:r>
+      <w:proofErr w:type="spellEnd"/>
+      <w:r>
+        <w:t xml:space="preserve"> </w:t>
+      </w:r>
+      <w:proofErr w:type="spellStart"/>
+      <w:r>
+        <w:t>borrower</w:t>
+      </w:r>
+      <w:proofErr w:type="spellEnd"/>
+      <w:r>
+        <w:t xml:space="preserve"> </w:t>
+      </w:r>
+      <w:proofErr w:type="spellStart"/>
+      <w:r>
+        <w:t>information</w:t>
+      </w:r>
+      <w:proofErr w:type="spellEnd"/>
     </w:p>
     <w:p>
       <w:pPr>
@@ -5526,7 +6485,7 @@
       </w:pPr>
       <w:r>
         <w:rPr>
-          <w:rStyle w:val="a6"/>
+          <w:rStyle w:val="a7"/>
           <w:b w:val="0"/>
           <w:bCs w:val="0"/>
         </w:rPr>
@@ -5562,9 +6521,19 @@
           <w:numId w:val="14"/>
         </w:numPr>
       </w:pPr>
-      <w:r>
-        <w:t>Add a book</w:t>
-      </w:r>
+      <w:proofErr w:type="spellStart"/>
+      <w:r>
+        <w:t>Add</w:t>
+      </w:r>
+      <w:proofErr w:type="spellEnd"/>
+      <w:r>
+        <w:t xml:space="preserve"> a </w:t>
+      </w:r>
+      <w:proofErr w:type="spellStart"/>
+      <w:r>
+        <w:t>book</w:t>
+      </w:r>
+      <w:proofErr w:type="spellEnd"/>
     </w:p>
     <w:p>
       <w:pPr>
@@ -5574,9 +6543,19 @@
           <w:numId w:val="14"/>
         </w:numPr>
       </w:pPr>
-      <w:r>
-        <w:t>Remove a book</w:t>
-      </w:r>
+      <w:proofErr w:type="spellStart"/>
+      <w:r>
+        <w:t>Remove</w:t>
+      </w:r>
+      <w:proofErr w:type="spellEnd"/>
+      <w:r>
+        <w:t xml:space="preserve"> a </w:t>
+      </w:r>
+      <w:proofErr w:type="spellStart"/>
+      <w:r>
+        <w:t>book</w:t>
+      </w:r>
+      <w:proofErr w:type="spellEnd"/>
     </w:p>
     <w:p>
       <w:pPr>
@@ -5587,8 +6566,21 @@
         </w:numPr>
       </w:pPr>
       <w:r>
-        <w:t>Search for a book</w:t>
-      </w:r>
+        <w:t xml:space="preserve">Search </w:t>
+      </w:r>
+      <w:proofErr w:type="spellStart"/>
+      <w:r>
+        <w:t>for</w:t>
+      </w:r>
+      <w:proofErr w:type="spellEnd"/>
+      <w:r>
+        <w:t xml:space="preserve"> a </w:t>
+      </w:r>
+      <w:proofErr w:type="spellStart"/>
+      <w:r>
+        <w:t>book</w:t>
+      </w:r>
+      <w:proofErr w:type="spellEnd"/>
     </w:p>
     <w:p>
       <w:pPr>
@@ -5599,8 +6591,21 @@
         </w:numPr>
       </w:pPr>
       <w:r>
-        <w:t>Display all books</w:t>
-      </w:r>
+        <w:t xml:space="preserve">Display </w:t>
+      </w:r>
+      <w:proofErr w:type="spellStart"/>
+      <w:r>
+        <w:t>all</w:t>
+      </w:r>
+      <w:proofErr w:type="spellEnd"/>
+      <w:r>
+        <w:t xml:space="preserve"> </w:t>
+      </w:r>
+      <w:proofErr w:type="spellStart"/>
+      <w:r>
+        <w:t>books</w:t>
+      </w:r>
+      <w:proofErr w:type="spellEnd"/>
     </w:p>
     <w:p>
       <w:pPr>
@@ -5610,9 +6615,19 @@
           <w:numId w:val="14"/>
         </w:numPr>
       </w:pPr>
-      <w:r>
-        <w:t>Add a member</w:t>
-      </w:r>
+      <w:proofErr w:type="spellStart"/>
+      <w:r>
+        <w:t>Add</w:t>
+      </w:r>
+      <w:proofErr w:type="spellEnd"/>
+      <w:r>
+        <w:t xml:space="preserve"> a </w:t>
+      </w:r>
+      <w:proofErr w:type="spellStart"/>
+      <w:r>
+        <w:t>member</w:t>
+      </w:r>
+      <w:proofErr w:type="spellEnd"/>
     </w:p>
     <w:p>
       <w:pPr>
@@ -5622,9 +6637,19 @@
           <w:numId w:val="14"/>
         </w:numPr>
       </w:pPr>
-      <w:r>
-        <w:t>Borrow a book</w:t>
-      </w:r>
+      <w:proofErr w:type="spellStart"/>
+      <w:r>
+        <w:t>Borrow</w:t>
+      </w:r>
+      <w:proofErr w:type="spellEnd"/>
+      <w:r>
+        <w:t xml:space="preserve"> a </w:t>
+      </w:r>
+      <w:proofErr w:type="spellStart"/>
+      <w:r>
+        <w:t>book</w:t>
+      </w:r>
+      <w:proofErr w:type="spellEnd"/>
     </w:p>
     <w:p>
       <w:pPr>
@@ -5635,8 +6660,13 @@
         </w:numPr>
       </w:pPr>
       <w:r>
-        <w:t>Return a book</w:t>
-      </w:r>
+        <w:t xml:space="preserve">Return a </w:t>
+      </w:r>
+      <w:proofErr w:type="spellStart"/>
+      <w:r>
+        <w:t>book</w:t>
+      </w:r>
+      <w:proofErr w:type="spellEnd"/>
     </w:p>
     <w:p>
       <w:pPr>
@@ -5647,8 +6677,29 @@
         </w:numPr>
       </w:pPr>
       <w:r>
-        <w:t>Save data to file</w:t>
-      </w:r>
+        <w:t xml:space="preserve">Save </w:t>
+      </w:r>
+      <w:proofErr w:type="spellStart"/>
+      <w:r>
+        <w:t>data</w:t>
+      </w:r>
+      <w:proofErr w:type="spellEnd"/>
+      <w:r>
+        <w:t xml:space="preserve"> </w:t>
+      </w:r>
+      <w:proofErr w:type="spellStart"/>
+      <w:r>
+        <w:t>to</w:t>
+      </w:r>
+      <w:proofErr w:type="spellEnd"/>
+      <w:r>
+        <w:t xml:space="preserve"> </w:t>
+      </w:r>
+      <w:proofErr w:type="spellStart"/>
+      <w:r>
+        <w:t>file</w:t>
+      </w:r>
+      <w:proofErr w:type="spellEnd"/>
     </w:p>
     <w:p>
       <w:pPr>
@@ -5658,9 +6709,35 @@
           <w:numId w:val="14"/>
         </w:numPr>
       </w:pPr>
-      <w:r>
-        <w:t>Load data from file</w:t>
-      </w:r>
+      <w:proofErr w:type="spellStart"/>
+      <w:r>
+        <w:t>Load</w:t>
+      </w:r>
+      <w:proofErr w:type="spellEnd"/>
+      <w:r>
+        <w:t xml:space="preserve"> </w:t>
+      </w:r>
+      <w:proofErr w:type="spellStart"/>
+      <w:r>
+        <w:t>data</w:t>
+      </w:r>
+      <w:proofErr w:type="spellEnd"/>
+      <w:r>
+        <w:t xml:space="preserve"> </w:t>
+      </w:r>
+      <w:proofErr w:type="spellStart"/>
+      <w:r>
+        <w:t>from</w:t>
+      </w:r>
+      <w:proofErr w:type="spellEnd"/>
+      <w:r>
+        <w:t xml:space="preserve"> </w:t>
+      </w:r>
+      <w:proofErr w:type="spellStart"/>
+      <w:r>
+        <w:t>file</w:t>
+      </w:r>
+      <w:proofErr w:type="spellEnd"/>
     </w:p>
     <w:p>
       <w:pPr>
@@ -5691,7 +6768,6 @@
     </w:p>
     <w:p>
       <w:r>
-        <w:lastRenderedPageBreak/>
         <w:pict w14:anchorId="0B4E29FC">
           <v:rect id="_x0000_i1030" style="width:0;height:1.5pt" o:hralign="center" o:hrstd="t" o:hr="t" fillcolor="#a0a0a0" stroked="f"/>
         </w:pict>
@@ -5703,7 +6779,7 @@
       </w:pPr>
       <w:r>
         <w:rPr>
-          <w:rStyle w:val="a6"/>
+          <w:rStyle w:val="a7"/>
           <w:b w:val="0"/>
           <w:bCs w:val="0"/>
         </w:rPr>
@@ -5732,9 +6808,35 @@
           <w:numId w:val="15"/>
         </w:numPr>
       </w:pPr>
-      <w:r>
-        <w:t>IDs must be numbers</w:t>
-      </w:r>
+      <w:proofErr w:type="spellStart"/>
+      <w:r>
+        <w:t>IDs</w:t>
+      </w:r>
+      <w:proofErr w:type="spellEnd"/>
+      <w:r>
+        <w:t xml:space="preserve"> </w:t>
+      </w:r>
+      <w:proofErr w:type="spellStart"/>
+      <w:r>
+        <w:t>must</w:t>
+      </w:r>
+      <w:proofErr w:type="spellEnd"/>
+      <w:r>
+        <w:t xml:space="preserve"> </w:t>
+      </w:r>
+      <w:proofErr w:type="spellStart"/>
+      <w:r>
+        <w:t>be</w:t>
+      </w:r>
+      <w:proofErr w:type="spellEnd"/>
+      <w:r>
+        <w:t xml:space="preserve"> </w:t>
+      </w:r>
+      <w:proofErr w:type="spellStart"/>
+      <w:r>
+        <w:t>numbers</w:t>
+      </w:r>
+      <w:proofErr w:type="spellEnd"/>
     </w:p>
     <w:p>
       <w:pPr>
@@ -5745,8 +6847,29 @@
         </w:numPr>
       </w:pPr>
       <w:r>
-        <w:t>Year must be a number</w:t>
-      </w:r>
+        <w:t xml:space="preserve">Year </w:t>
+      </w:r>
+      <w:proofErr w:type="spellStart"/>
+      <w:r>
+        <w:t>must</w:t>
+      </w:r>
+      <w:proofErr w:type="spellEnd"/>
+      <w:r>
+        <w:t xml:space="preserve"> </w:t>
+      </w:r>
+      <w:proofErr w:type="spellStart"/>
+      <w:r>
+        <w:t>be</w:t>
+      </w:r>
+      <w:proofErr w:type="spellEnd"/>
+      <w:r>
+        <w:t xml:space="preserve"> a </w:t>
+      </w:r>
+      <w:proofErr w:type="spellStart"/>
+      <w:r>
+        <w:t>number</w:t>
+      </w:r>
+      <w:proofErr w:type="spellEnd"/>
     </w:p>
     <w:p>
       <w:pPr>
@@ -5847,10 +6970,11 @@
       </w:pPr>
       <w:r>
         <w:rPr>
-          <w:rStyle w:val="a6"/>
+          <w:rStyle w:val="a7"/>
           <w:b w:val="0"/>
           <w:bCs w:val="0"/>
         </w:rPr>
+        <w:lastRenderedPageBreak/>
         <w:t>6. Object-Oriented Programming Concepts Used</w:t>
       </w:r>
     </w:p>
@@ -5881,7 +7005,7 @@
       </w:pPr>
       <w:r>
         <w:rPr>
-          <w:rStyle w:val="a6"/>
+          <w:rStyle w:val="a7"/>
           <w:lang w:val="en-US"/>
         </w:rPr>
         <w:t>Classes and Objects:</w:t>
@@ -5906,7 +7030,7 @@
       </w:pPr>
       <w:r>
         <w:rPr>
-          <w:rStyle w:val="a6"/>
+          <w:rStyle w:val="a7"/>
           <w:lang w:val="en-US"/>
         </w:rPr>
         <w:t>Constructors:</w:t>
@@ -5931,7 +7055,7 @@
       </w:pPr>
       <w:r>
         <w:rPr>
-          <w:rStyle w:val="a6"/>
+          <w:rStyle w:val="a7"/>
           <w:lang w:val="en-US"/>
         </w:rPr>
         <w:t>Encapsulation:</w:t>
@@ -5956,7 +7080,7 @@
       </w:pPr>
       <w:r>
         <w:rPr>
-          <w:rStyle w:val="a6"/>
+          <w:rStyle w:val="a7"/>
           <w:lang w:val="en-US"/>
         </w:rPr>
         <w:t>Modularity:</w:t>
@@ -5981,7 +7105,7 @@
       </w:pPr>
       <w:r>
         <w:rPr>
-          <w:rStyle w:val="a6"/>
+          <w:rStyle w:val="a7"/>
           <w:lang w:val="en-US"/>
         </w:rPr>
         <w:t>Data abstraction:</w:t>
@@ -6109,31 +7233,148 @@
       <w:pPr>
         <w:pStyle w:val="1"/>
         <w:rPr>
-          <w:sz w:val="28"/>
-          <w:szCs w:val="28"/>
-          <w:lang w:val="en-US"/>
-        </w:rPr>
-      </w:pPr>
-      <w:r>
-        <w:rPr>
-          <w:rStyle w:val="a6"/>
+          <w:rStyle w:val="a7"/>
           <w:b/>
           <w:bCs/>
           <w:sz w:val="28"/>
           <w:szCs w:val="28"/>
           <w:lang w:val="en-US"/>
         </w:rPr>
-        <w:t>6.</w:t>
-      </w:r>
-      <w:r>
-        <w:rPr>
-          <w:rStyle w:val="a6"/>
+      </w:pPr>
+    </w:p>
+    <w:p>
+      <w:pPr>
+        <w:pStyle w:val="1"/>
+        <w:rPr>
+          <w:rStyle w:val="a7"/>
           <w:b/>
           <w:bCs/>
           <w:sz w:val="28"/>
           <w:szCs w:val="28"/>
           <w:lang w:val="en-US"/>
         </w:rPr>
+      </w:pPr>
+    </w:p>
+    <w:p>
+      <w:pPr>
+        <w:pStyle w:val="1"/>
+        <w:rPr>
+          <w:rStyle w:val="a7"/>
+          <w:b/>
+          <w:bCs/>
+          <w:sz w:val="28"/>
+          <w:szCs w:val="28"/>
+          <w:lang w:val="en-US"/>
+        </w:rPr>
+      </w:pPr>
+    </w:p>
+    <w:p>
+      <w:pPr>
+        <w:pStyle w:val="1"/>
+        <w:rPr>
+          <w:rStyle w:val="a7"/>
+          <w:b/>
+          <w:bCs/>
+          <w:sz w:val="28"/>
+          <w:szCs w:val="28"/>
+          <w:lang w:val="en-US"/>
+        </w:rPr>
+      </w:pPr>
+    </w:p>
+    <w:p>
+      <w:pPr>
+        <w:pStyle w:val="1"/>
+        <w:rPr>
+          <w:rStyle w:val="a7"/>
+          <w:b/>
+          <w:bCs/>
+          <w:sz w:val="28"/>
+          <w:szCs w:val="28"/>
+          <w:lang w:val="en-US"/>
+        </w:rPr>
+      </w:pPr>
+    </w:p>
+    <w:p>
+      <w:pPr>
+        <w:pStyle w:val="1"/>
+        <w:rPr>
+          <w:rStyle w:val="a7"/>
+          <w:b/>
+          <w:bCs/>
+          <w:sz w:val="28"/>
+          <w:szCs w:val="28"/>
+          <w:lang w:val="en-US"/>
+        </w:rPr>
+      </w:pPr>
+    </w:p>
+    <w:p>
+      <w:pPr>
+        <w:pStyle w:val="1"/>
+        <w:rPr>
+          <w:rStyle w:val="a7"/>
+          <w:b/>
+          <w:bCs/>
+          <w:sz w:val="28"/>
+          <w:szCs w:val="28"/>
+          <w:lang w:val="en-US"/>
+        </w:rPr>
+      </w:pPr>
+    </w:p>
+    <w:p>
+      <w:pPr>
+        <w:pStyle w:val="1"/>
+        <w:rPr>
+          <w:rStyle w:val="a7"/>
+          <w:b/>
+          <w:bCs/>
+          <w:sz w:val="28"/>
+          <w:szCs w:val="28"/>
+          <w:lang w:val="en-US"/>
+        </w:rPr>
+      </w:pPr>
+    </w:p>
+    <w:p>
+      <w:pPr>
+        <w:pStyle w:val="1"/>
+        <w:rPr>
+          <w:rStyle w:val="a7"/>
+          <w:b/>
+          <w:bCs/>
+          <w:sz w:val="28"/>
+          <w:szCs w:val="28"/>
+          <w:lang w:val="en-US"/>
+        </w:rPr>
+      </w:pPr>
+    </w:p>
+    <w:p>
+      <w:pPr>
+        <w:pStyle w:val="1"/>
+        <w:rPr>
+          <w:sz w:val="28"/>
+          <w:szCs w:val="28"/>
+          <w:lang w:val="en-US"/>
+        </w:rPr>
+      </w:pPr>
+      <w:r>
+        <w:rPr>
+          <w:rStyle w:val="a7"/>
+          <w:b/>
+          <w:bCs/>
+          <w:sz w:val="28"/>
+          <w:szCs w:val="28"/>
+          <w:lang w:val="en-US"/>
+        </w:rPr>
+        <w:t>6.</w:t>
+      </w:r>
+      <w:r>
+        <w:rPr>
+          <w:rStyle w:val="a7"/>
+          <w:b/>
+          <w:bCs/>
+          <w:sz w:val="28"/>
+          <w:szCs w:val="28"/>
+          <w:lang w:val="en-US"/>
+        </w:rPr>
         <w:t>Sample Screenshots of the Application</w:t>
       </w:r>
     </w:p>
@@ -6148,7 +7389,53 @@
         <w:rPr>
           <w:lang w:val="en-US"/>
         </w:rPr>
-        <w:t>This section presents sample screenshots of the Library Management System while running in the console. The images demonstrate how the user interacts with the application and how different operations are performed.</w:t>
+        <w:t>Screenshots of library management system when displaying in console In this section some sample screenshot of library management system</w:t>
+      </w:r>
+      <w:r>
+        <w:t> </w:t>
+      </w:r>
+      <w:r>
+        <w:rPr>
+          <w:lang w:val="en-US"/>
+        </w:rPr>
+        <w:t>displayed in the Console. The images show how the user</w:t>
+      </w:r>
+      <w:r>
+        <w:t> </w:t>
+      </w:r>
+      <w:r>
+        <w:rPr>
+          <w:lang w:val="en-US"/>
+        </w:rPr>
+        <w:t xml:space="preserve">interacts with the </w:t>
+      </w:r>
+      <w:proofErr w:type="spellStart"/>
+      <w:r>
+        <w:rPr>
+          <w:lang w:val="en-US"/>
+        </w:rPr>
+        <w:t>applica</w:t>
+      </w:r>
+      <w:proofErr w:type="spellEnd"/>
+      <w:r>
+        <w:rPr>
+          <w:lang w:val="en-US"/>
+        </w:rPr>
+        <w:t xml:space="preserve">- </w:t>
+      </w:r>
+      <w:proofErr w:type="spellStart"/>
+      <w:r>
+        <w:rPr>
+          <w:lang w:val="en-US"/>
+        </w:rPr>
+        <w:t>tion</w:t>
+      </w:r>
+      <w:proofErr w:type="spellEnd"/>
+      <w:r>
+        <w:rPr>
+          <w:lang w:val="en-US"/>
+        </w:rPr>
+        <w:t xml:space="preserve"> and what kind of operations takes place.</w:t>
       </w:r>
     </w:p>
     <w:p>
@@ -6157,7 +7444,7 @@
       </w:pPr>
       <w:r>
         <w:rPr>
-          <w:rStyle w:val="a6"/>
+          <w:rStyle w:val="a7"/>
           <w:b w:val="0"/>
           <w:bCs w:val="0"/>
         </w:rPr>
@@ -6175,29 +7462,101 @@
         <w:rPr>
           <w:lang w:val="en-US"/>
         </w:rPr>
-        <w:t>This screenshot shows the main menu displayed when the application starts.</w:t>
-      </w:r>
-      <w:r>
-        <w:rPr>
-          <w:lang w:val="en-US"/>
-        </w:rPr>
-        <w:br/>
-        <w:t>It allows the user to choose any operation such as adding books, searching, borrowing, or saving data.</w:t>
+        <w:t xml:space="preserve">This is the main screen that comes out when you </w:t>
+      </w:r>
+      <w:proofErr w:type="spellStart"/>
+      <w:r>
+        <w:rPr>
+          <w:lang w:val="en-US"/>
+        </w:rPr>
+        <w:t>maximise</w:t>
+      </w:r>
+      <w:proofErr w:type="spellEnd"/>
+      <w:r>
+        <w:rPr>
+          <w:lang w:val="en-US"/>
+        </w:rPr>
+        <w:t xml:space="preserve"> this</w:t>
+      </w:r>
+      <w:r>
+        <w:t> </w:t>
+      </w:r>
+      <w:r>
+        <w:rPr>
+          <w:lang w:val="en-US"/>
+        </w:rPr>
+        <w:t>application.</w:t>
       </w:r>
     </w:p>
     <w:p>
       <w:pPr>
         <w:pStyle w:val="a5"/>
-      </w:pPr>
-      <w:r>
-        <w:rPr>
-          <w:rStyle w:val="a7"/>
-          <w:rFonts w:eastAsiaTheme="majorEastAsia"/>
-        </w:rPr>
-        <w:t>(Insert Screenshot Here)</w:t>
-      </w:r>
-    </w:p>
-    <w:p>
+        <w:rPr>
+          <w:lang w:val="en-US"/>
+        </w:rPr>
+      </w:pPr>
+      <w:r>
+        <w:rPr>
+          <w:lang w:val="en-US"/>
+        </w:rPr>
+        <w:t>It makes accessible the operation line to the user, who is then able to select any operation such as adding of books, searching or borrowing and saving of</w:t>
+      </w:r>
+      <w:r>
+        <w:t> </w:t>
+      </w:r>
+      <w:r>
+        <w:rPr>
+          <w:lang w:val="en-US"/>
+        </w:rPr>
+        <w:t>data.</w:t>
+      </w:r>
+    </w:p>
+    <w:p>
+      <w:r>
+        <w:rPr>
+          <w:rStyle w:val="a8"/>
+          <w:rFonts w:ascii="Times New Roman" w:eastAsiaTheme="majorEastAsia" w:hAnsi="Times New Roman" w:cs="Times New Roman"/>
+          <w:noProof/>
+          <w:sz w:val="24"/>
+          <w:szCs w:val="24"/>
+          <w:lang w:val="ru-RU" w:eastAsia="ru-RU"/>
+        </w:rPr>
+        <w:drawing>
+          <wp:inline distT="0" distB="0" distL="0" distR="0" wp14:anchorId="06F38E22" wp14:editId="48A06D24">
+            <wp:extent cx="3219899" cy="2372056"/>
+            <wp:effectExtent l="0" t="0" r="0" b="9525"/>
+            <wp:docPr id="3" name="Рисунок 3"/>
+            <wp:cNvGraphicFramePr>
+              <a:graphicFrameLocks xmlns:a="http://schemas.openxmlformats.org/drawingml/2006/main" noChangeAspect="1"/>
+            </wp:cNvGraphicFramePr>
+            <a:graphic xmlns:a="http://schemas.openxmlformats.org/drawingml/2006/main">
+              <a:graphicData uri="http://schemas.openxmlformats.org/drawingml/2006/picture">
+                <pic:pic xmlns:pic="http://schemas.openxmlformats.org/drawingml/2006/picture">
+                  <pic:nvPicPr>
+                    <pic:cNvPr id="1" name=""/>
+                    <pic:cNvPicPr/>
+                  </pic:nvPicPr>
+                  <pic:blipFill>
+                    <a:blip r:embed="rId7"/>
+                    <a:stretch>
+                      <a:fillRect/>
+                    </a:stretch>
+                  </pic:blipFill>
+                  <pic:spPr>
+                    <a:xfrm>
+                      <a:off x="0" y="0"/>
+                      <a:ext cx="3219899" cy="2372056"/>
+                    </a:xfrm>
+                    <a:prstGeom prst="rect">
+                      <a:avLst/>
+                    </a:prstGeom>
+                  </pic:spPr>
+                </pic:pic>
+              </a:graphicData>
+            </a:graphic>
+          </wp:inline>
+        </w:drawing>
+      </w:r>
       <w:r>
         <w:pict w14:anchorId="723350DF">
           <v:rect id="_x0000_i1032" style="width:0;height:1.5pt" o:hralign="center" o:hrstd="t" o:hr="t" fillcolor="#a0a0a0" stroked="f"/>
@@ -6207,13 +7566,93 @@
     <w:p>
       <w:pPr>
         <w:pStyle w:val="3"/>
-      </w:pPr>
-      <w:r>
-        <w:rPr>
-          <w:rStyle w:val="a6"/>
+        <w:rPr>
+          <w:rStyle w:val="a7"/>
           <w:b w:val="0"/>
           <w:bCs w:val="0"/>
         </w:rPr>
+      </w:pPr>
+    </w:p>
+    <w:p>
+      <w:pPr>
+        <w:pStyle w:val="3"/>
+        <w:rPr>
+          <w:rStyle w:val="a7"/>
+          <w:b w:val="0"/>
+          <w:bCs w:val="0"/>
+        </w:rPr>
+      </w:pPr>
+    </w:p>
+    <w:p>
+      <w:pPr>
+        <w:pStyle w:val="3"/>
+        <w:rPr>
+          <w:rStyle w:val="a7"/>
+          <w:b w:val="0"/>
+          <w:bCs w:val="0"/>
+        </w:rPr>
+      </w:pPr>
+    </w:p>
+    <w:p>
+      <w:pPr>
+        <w:pStyle w:val="3"/>
+        <w:rPr>
+          <w:rStyle w:val="a7"/>
+          <w:b w:val="0"/>
+          <w:bCs w:val="0"/>
+        </w:rPr>
+      </w:pPr>
+    </w:p>
+    <w:p>
+      <w:pPr>
+        <w:pStyle w:val="3"/>
+        <w:rPr>
+          <w:rStyle w:val="a7"/>
+          <w:b w:val="0"/>
+          <w:bCs w:val="0"/>
+        </w:rPr>
+      </w:pPr>
+    </w:p>
+    <w:p>
+      <w:pPr>
+        <w:pStyle w:val="3"/>
+        <w:rPr>
+          <w:rStyle w:val="a7"/>
+          <w:b w:val="0"/>
+          <w:bCs w:val="0"/>
+        </w:rPr>
+      </w:pPr>
+    </w:p>
+    <w:p>
+      <w:pPr>
+        <w:pStyle w:val="3"/>
+        <w:rPr>
+          <w:rStyle w:val="a7"/>
+          <w:b w:val="0"/>
+          <w:bCs w:val="0"/>
+        </w:rPr>
+      </w:pPr>
+    </w:p>
+    <w:p>
+      <w:pPr>
+        <w:pStyle w:val="3"/>
+        <w:rPr>
+          <w:rStyle w:val="a7"/>
+          <w:b w:val="0"/>
+          <w:bCs w:val="0"/>
+        </w:rPr>
+      </w:pPr>
+    </w:p>
+    <w:p>
+      <w:pPr>
+        <w:pStyle w:val="3"/>
+      </w:pPr>
+      <w:r>
+        <w:rPr>
+          <w:rStyle w:val="a7"/>
+          <w:b w:val="0"/>
+          <w:bCs w:val="0"/>
+        </w:rPr>
         <w:t>2. Adding a New Book</w:t>
       </w:r>
     </w:p>
@@ -6239,18 +7678,51 @@
       </w:r>
     </w:p>
     <w:p>
-      <w:pPr>
-        <w:pStyle w:val="a5"/>
-      </w:pPr>
-      <w:r>
-        <w:rPr>
-          <w:rStyle w:val="a7"/>
-          <w:rFonts w:eastAsiaTheme="majorEastAsia"/>
-        </w:rPr>
-        <w:t>(Insert Screenshot Here)</w:t>
-      </w:r>
-    </w:p>
-    <w:p>
+      <w:r>
+        <w:rPr>
+          <w:rStyle w:val="a8"/>
+          <w:rFonts w:ascii="Times New Roman" w:eastAsiaTheme="majorEastAsia" w:hAnsi="Times New Roman" w:cs="Times New Roman"/>
+          <w:noProof/>
+          <w:sz w:val="24"/>
+          <w:szCs w:val="24"/>
+          <w:lang w:val="ru-RU" w:eastAsia="ru-RU"/>
+        </w:rPr>
+        <w:drawing>
+          <wp:inline distT="0" distB="0" distL="0" distR="0" wp14:anchorId="14ABD7F6" wp14:editId="22962A42">
+            <wp:extent cx="2766349" cy="2447290"/>
+            <wp:effectExtent l="0" t="0" r="0" b="0"/>
+            <wp:docPr id="4" name="Рисунок 4"/>
+            <wp:cNvGraphicFramePr>
+              <a:graphicFrameLocks xmlns:a="http://schemas.openxmlformats.org/drawingml/2006/main" noChangeAspect="1"/>
+            </wp:cNvGraphicFramePr>
+            <a:graphic xmlns:a="http://schemas.openxmlformats.org/drawingml/2006/main">
+              <a:graphicData uri="http://schemas.openxmlformats.org/drawingml/2006/picture">
+                <pic:pic xmlns:pic="http://schemas.openxmlformats.org/drawingml/2006/picture">
+                  <pic:nvPicPr>
+                    <pic:cNvPr id="1" name=""/>
+                    <pic:cNvPicPr/>
+                  </pic:nvPicPr>
+                  <pic:blipFill>
+                    <a:blip r:embed="rId8"/>
+                    <a:stretch>
+                      <a:fillRect/>
+                    </a:stretch>
+                  </pic:blipFill>
+                  <pic:spPr>
+                    <a:xfrm>
+                      <a:off x="0" y="0"/>
+                      <a:ext cx="2766349" cy="2447290"/>
+                    </a:xfrm>
+                    <a:prstGeom prst="rect">
+                      <a:avLst/>
+                    </a:prstGeom>
+                  </pic:spPr>
+                </pic:pic>
+              </a:graphicData>
+            </a:graphic>
+          </wp:inline>
+        </w:drawing>
+      </w:r>
       <w:r>
         <w:pict w14:anchorId="35B27692">
           <v:rect id="_x0000_i1033" style="width:0;height:1.5pt" o:hralign="center" o:hrstd="t" o:hr="t" fillcolor="#a0a0a0" stroked="f"/>
@@ -6263,7 +7735,7 @@
       </w:pPr>
       <w:r>
         <w:rPr>
-          <w:rStyle w:val="a6"/>
+          <w:rStyle w:val="a7"/>
           <w:b w:val="0"/>
           <w:bCs w:val="0"/>
         </w:rPr>
@@ -6292,18 +7764,51 @@
       </w:r>
     </w:p>
     <w:p>
-      <w:pPr>
-        <w:pStyle w:val="a5"/>
-      </w:pPr>
-      <w:r>
-        <w:rPr>
-          <w:rStyle w:val="a7"/>
-          <w:rFonts w:eastAsiaTheme="majorEastAsia"/>
-        </w:rPr>
-        <w:t>(Insert Screenshot Here)</w:t>
-      </w:r>
-    </w:p>
-    <w:p>
+      <w:r>
+        <w:rPr>
+          <w:rStyle w:val="a8"/>
+          <w:rFonts w:ascii="Times New Roman" w:eastAsiaTheme="majorEastAsia" w:hAnsi="Times New Roman" w:cs="Times New Roman"/>
+          <w:noProof/>
+          <w:sz w:val="24"/>
+          <w:szCs w:val="24"/>
+          <w:lang w:val="ru-RU" w:eastAsia="ru-RU"/>
+        </w:rPr>
+        <w:drawing>
+          <wp:inline distT="0" distB="0" distL="0" distR="0" wp14:anchorId="3959CB9D" wp14:editId="2BF05DD1">
+            <wp:extent cx="3615872" cy="1799863"/>
+            <wp:effectExtent l="0" t="0" r="3810" b="0"/>
+            <wp:docPr id="5" name="Рисунок 5"/>
+            <wp:cNvGraphicFramePr>
+              <a:graphicFrameLocks xmlns:a="http://schemas.openxmlformats.org/drawingml/2006/main" noChangeAspect="1"/>
+            </wp:cNvGraphicFramePr>
+            <a:graphic xmlns:a="http://schemas.openxmlformats.org/drawingml/2006/main">
+              <a:graphicData uri="http://schemas.openxmlformats.org/drawingml/2006/picture">
+                <pic:pic xmlns:pic="http://schemas.openxmlformats.org/drawingml/2006/picture">
+                  <pic:nvPicPr>
+                    <pic:cNvPr id="1" name=""/>
+                    <pic:cNvPicPr/>
+                  </pic:nvPicPr>
+                  <pic:blipFill>
+                    <a:blip r:embed="rId9"/>
+                    <a:stretch>
+                      <a:fillRect/>
+                    </a:stretch>
+                  </pic:blipFill>
+                  <pic:spPr>
+                    <a:xfrm>
+                      <a:off x="0" y="0"/>
+                      <a:ext cx="3639413" cy="1811581"/>
+                    </a:xfrm>
+                    <a:prstGeom prst="rect">
+                      <a:avLst/>
+                    </a:prstGeom>
+                  </pic:spPr>
+                </pic:pic>
+              </a:graphicData>
+            </a:graphic>
+          </wp:inline>
+        </w:drawing>
+      </w:r>
       <w:r>
         <w:pict w14:anchorId="1A7B86C0">
           <v:rect id="_x0000_i1034" style="width:0;height:1.5pt" o:hralign="center" o:hrstd="t" o:hr="t" fillcolor="#a0a0a0" stroked="f"/>
@@ -6316,10 +7821,11 @@
       </w:pPr>
       <w:r>
         <w:rPr>
-          <w:rStyle w:val="a6"/>
+          <w:rStyle w:val="a7"/>
           <w:b w:val="0"/>
           <w:bCs w:val="0"/>
         </w:rPr>
+        <w:lastRenderedPageBreak/>
         <w:t>4. Borrowing and Returning Books</w:t>
       </w:r>
     </w:p>
@@ -6339,62 +7845,137 @@
     </w:p>
     <w:p>
       <w:pPr>
-        <w:pStyle w:val="a5"/>
-        <w:rPr>
-          <w:lang w:val="en-US"/>
-        </w:rPr>
-      </w:pPr>
-      <w:r>
-        <w:rPr>
-          <w:rStyle w:val="a7"/>
-          <w:rFonts w:eastAsiaTheme="majorEastAsia"/>
-          <w:lang w:val="en-US"/>
-        </w:rPr>
-        <w:t>(Insert Screenshot Here)</w:t>
-      </w:r>
-    </w:p>
-    <w:p>
-      <w:pPr>
-        <w:rPr>
-          <w:rFonts w:ascii="Times New Roman" w:hAnsi="Times New Roman" w:cs="Times New Roman"/>
-          <w:sz w:val="24"/>
-          <w:szCs w:val="24"/>
-        </w:rPr>
-      </w:pPr>
-    </w:p>
-    <w:p>
-      <w:pPr>
-        <w:rPr>
-          <w:rFonts w:ascii="Times New Roman" w:hAnsi="Times New Roman" w:cs="Times New Roman"/>
-          <w:sz w:val="24"/>
-          <w:szCs w:val="24"/>
-        </w:rPr>
-      </w:pPr>
-    </w:p>
-    <w:p>
-      <w:pPr>
-        <w:rPr>
-          <w:rFonts w:ascii="Times New Roman" w:hAnsi="Times New Roman" w:cs="Times New Roman"/>
-          <w:sz w:val="24"/>
-          <w:szCs w:val="24"/>
-        </w:rPr>
-      </w:pPr>
-    </w:p>
-    <w:p>
-      <w:pPr>
-        <w:rPr>
-          <w:rFonts w:ascii="Times New Roman" w:hAnsi="Times New Roman" w:cs="Times New Roman"/>
-          <w:sz w:val="24"/>
-          <w:szCs w:val="24"/>
-        </w:rPr>
-      </w:pPr>
-    </w:p>
-    <w:p>
-      <w:pPr>
-        <w:rPr>
-          <w:rFonts w:ascii="Times New Roman" w:hAnsi="Times New Roman" w:cs="Times New Roman"/>
-          <w:sz w:val="24"/>
-          <w:szCs w:val="24"/>
+        <w:rPr>
+          <w:rFonts w:ascii="Times New Roman" w:hAnsi="Times New Roman" w:cs="Times New Roman"/>
+          <w:sz w:val="24"/>
+          <w:szCs w:val="24"/>
+        </w:rPr>
+      </w:pPr>
+      <w:r>
+        <w:rPr>
+          <w:rStyle w:val="a8"/>
+          <w:rFonts w:ascii="Times New Roman" w:eastAsiaTheme="majorEastAsia" w:hAnsi="Times New Roman" w:cs="Times New Roman"/>
+          <w:noProof/>
+          <w:sz w:val="24"/>
+          <w:szCs w:val="24"/>
+          <w:lang w:eastAsia="ru-RU"/>
+        </w:rPr>
+        <w:drawing>
+          <wp:inline distT="0" distB="0" distL="0" distR="0" wp14:anchorId="2DA896B4" wp14:editId="37AA3A01">
+            <wp:extent cx="4944165" cy="4896533"/>
+            <wp:effectExtent l="0" t="0" r="8890" b="0"/>
+            <wp:docPr id="6" name="Рисунок 6"/>
+            <wp:cNvGraphicFramePr>
+              <a:graphicFrameLocks xmlns:a="http://schemas.openxmlformats.org/drawingml/2006/main" noChangeAspect="1"/>
+            </wp:cNvGraphicFramePr>
+            <a:graphic xmlns:a="http://schemas.openxmlformats.org/drawingml/2006/main">
+              <a:graphicData uri="http://schemas.openxmlformats.org/drawingml/2006/picture">
+                <pic:pic xmlns:pic="http://schemas.openxmlformats.org/drawingml/2006/picture">
+                  <pic:nvPicPr>
+                    <pic:cNvPr id="1" name=""/>
+                    <pic:cNvPicPr/>
+                  </pic:nvPicPr>
+                  <pic:blipFill>
+                    <a:blip r:embed="rId10"/>
+                    <a:stretch>
+                      <a:fillRect/>
+                    </a:stretch>
+                  </pic:blipFill>
+                  <pic:spPr>
+                    <a:xfrm>
+                      <a:off x="0" y="0"/>
+                      <a:ext cx="4944165" cy="4896533"/>
+                    </a:xfrm>
+                    <a:prstGeom prst="rect">
+                      <a:avLst/>
+                    </a:prstGeom>
+                  </pic:spPr>
+                </pic:pic>
+              </a:graphicData>
+            </a:graphic>
+          </wp:inline>
+        </w:drawing>
+      </w:r>
+    </w:p>
+    <w:p>
+      <w:pPr>
+        <w:rPr>
+          <w:rFonts w:ascii="Times New Roman" w:hAnsi="Times New Roman" w:cs="Times New Roman"/>
+          <w:sz w:val="24"/>
+          <w:szCs w:val="24"/>
+        </w:rPr>
+      </w:pPr>
+    </w:p>
+    <w:p>
+      <w:pPr>
+        <w:rPr>
+          <w:rFonts w:ascii="Times New Roman" w:hAnsi="Times New Roman" w:cs="Times New Roman"/>
+          <w:sz w:val="24"/>
+          <w:szCs w:val="24"/>
+        </w:rPr>
+      </w:pPr>
+    </w:p>
+    <w:p>
+      <w:pPr>
+        <w:rPr>
+          <w:rFonts w:ascii="Times New Roman" w:hAnsi="Times New Roman" w:cs="Times New Roman"/>
+          <w:sz w:val="24"/>
+          <w:szCs w:val="24"/>
+        </w:rPr>
+      </w:pPr>
+    </w:p>
+    <w:p>
+      <w:pPr>
+        <w:rPr>
+          <w:rFonts w:ascii="Times New Roman" w:hAnsi="Times New Roman" w:cs="Times New Roman"/>
+          <w:sz w:val="24"/>
+          <w:szCs w:val="24"/>
+        </w:rPr>
+      </w:pPr>
+    </w:p>
+    <w:p>
+      <w:pPr>
+        <w:rPr>
+          <w:rFonts w:ascii="Times New Roman" w:hAnsi="Times New Roman" w:cs="Times New Roman"/>
+          <w:sz w:val="24"/>
+          <w:szCs w:val="24"/>
+        </w:rPr>
+      </w:pPr>
+    </w:p>
+    <w:p>
+      <w:pPr>
+        <w:rPr>
+          <w:rFonts w:ascii="Times New Roman" w:hAnsi="Times New Roman" w:cs="Times New Roman"/>
+          <w:sz w:val="24"/>
+          <w:szCs w:val="24"/>
+        </w:rPr>
+      </w:pPr>
+    </w:p>
+    <w:p>
+      <w:pPr>
+        <w:rPr>
+          <w:rFonts w:ascii="Times New Roman" w:hAnsi="Times New Roman" w:cs="Times New Roman"/>
+          <w:sz w:val="24"/>
+          <w:szCs w:val="24"/>
+        </w:rPr>
+      </w:pPr>
+    </w:p>
+    <w:p>
+      <w:pPr>
+        <w:rPr>
+          <w:rFonts w:ascii="Times New Roman" w:hAnsi="Times New Roman" w:cs="Times New Roman"/>
+          <w:sz w:val="24"/>
+          <w:szCs w:val="24"/>
+        </w:rPr>
+      </w:pPr>
+    </w:p>
+    <w:p>
+      <w:pPr>
+        <w:rPr>
+          <w:rFonts w:ascii="Times New Roman" w:hAnsi="Times New Roman" w:cs="Times New Roman"/>
+          <w:sz w:val="24"/>
+          <w:szCs w:val="24"/>
+          <w:lang w:val="ru-RU"/>
         </w:rPr>
       </w:pPr>
     </w:p>
@@ -6413,28 +7994,48 @@
       </w:pPr>
       <w:r>
         <w:rPr>
-          <w:rStyle w:val="a6"/>
+          <w:rStyle w:val="a7"/>
           <w:b/>
           <w:bCs/>
           <w:sz w:val="28"/>
           <w:szCs w:val="28"/>
           <w:lang w:val="en-US"/>
         </w:rPr>
+        <w:lastRenderedPageBreak/>
         <w:t>Validations Handled</w:t>
       </w:r>
     </w:p>
     <w:p>
       <w:pPr>
         <w:pStyle w:val="a5"/>
-        <w:rPr>
-          <w:lang w:val="en-US"/>
-        </w:rPr>
-      </w:pPr>
-      <w:r>
-        <w:rPr>
-          <w:lang w:val="en-US"/>
-        </w:rPr>
-        <w:t>The application includes several validation mechanisms to ensure that the data entered by the user is correct and does not cause system errors. These validations help maintain data integrity and prevent invalid operations during program execution.</w:t>
+        <w:ind w:left="360"/>
+        <w:rPr>
+          <w:lang w:val="en-US"/>
+        </w:rPr>
+      </w:pPr>
+      <w:r>
+        <w:rPr>
+          <w:lang w:val="en-US"/>
+        </w:rPr>
+        <w:t>In the event, such kind of safety gates need to be treated in more than one way. The application has several validation mechanism are</w:t>
+      </w:r>
+      <w:r>
+        <w:t> </w:t>
+      </w:r>
+      <w:r>
+        <w:rPr>
+          <w:lang w:val="en-US"/>
+        </w:rPr>
+        <w:t>included with the introduction that data provided by users should be valid and give no system errors. Such checks ensure the integrity of data is</w:t>
+      </w:r>
+      <w:r>
+        <w:t> </w:t>
+      </w:r>
+      <w:r>
+        <w:rPr>
+          <w:lang w:val="en-US"/>
+        </w:rPr>
+        <w:t>maintained and invalid transformations are avoided during execution.</w:t>
       </w:r>
     </w:p>
     <w:p>
@@ -6443,7 +8044,7 @@
       </w:pPr>
       <w:r>
         <w:rPr>
-          <w:rStyle w:val="a6"/>
+          <w:rStyle w:val="a7"/>
           <w:b w:val="0"/>
           <w:bCs w:val="0"/>
         </w:rPr>
@@ -6465,7 +8066,16 @@
         <w:rPr>
           <w:lang w:val="en-US"/>
         </w:rPr>
-        <w:t>Book IDs and Member IDs must be positive integers.</w:t>
+        <w:t>Book IDs and Member IDs</w:t>
+      </w:r>
+      <w:r>
+        <w:t> </w:t>
+      </w:r>
+      <w:r>
+        <w:rPr>
+          <w:lang w:val="en-US"/>
+        </w:rPr>
+        <w:t>will be Above 0.</w:t>
       </w:r>
     </w:p>
     <w:p>
@@ -6483,7 +8093,7 @@
         <w:rPr>
           <w:lang w:val="en-US"/>
         </w:rPr>
-        <w:t>The system checks whether the input contains only digits.</w:t>
+        <w:t>The system verifies that the input consists of digits only.</w:t>
       </w:r>
     </w:p>
     <w:p>
@@ -6501,7 +8111,16 @@
         <w:rPr>
           <w:lang w:val="en-US"/>
         </w:rPr>
-        <w:t>If the input is not a valid number, the user is prompted to enter it again.</w:t>
+        <w:t>If the number is invalid then user will be</w:t>
+      </w:r>
+      <w:r>
+        <w:t> </w:t>
+      </w:r>
+      <w:r>
+        <w:rPr>
+          <w:lang w:val="en-US"/>
+        </w:rPr>
+        <w:t>asked to enter again.</w:t>
       </w:r>
     </w:p>
     <w:p>
@@ -6510,7 +8129,7 @@
       </w:pPr>
       <w:r>
         <w:rPr>
-          <w:rStyle w:val="a6"/>
+          <w:rStyle w:val="a7"/>
           <w:b w:val="0"/>
           <w:bCs w:val="0"/>
         </w:rPr>
@@ -6559,7 +8178,7 @@
       </w:pPr>
       <w:r>
         <w:rPr>
-          <w:rStyle w:val="a6"/>
+          <w:rStyle w:val="a7"/>
           <w:b w:val="0"/>
           <w:bCs w:val="0"/>
         </w:rPr>
@@ -6581,7 +8200,16 @@
         <w:rPr>
           <w:lang w:val="en-US"/>
         </w:rPr>
-        <w:t>A book cannot be removed from the system if it is currently borrowed by a member.</w:t>
+        <w:t>If a member is borrowing the book, then that book cannot be deleted</w:t>
+      </w:r>
+      <w:r>
+        <w:t> </w:t>
+      </w:r>
+      <w:r>
+        <w:rPr>
+          <w:lang w:val="en-US"/>
+        </w:rPr>
+        <w:t>from the system.</w:t>
       </w:r>
     </w:p>
     <w:p>
@@ -6599,7 +8227,7 @@
         <w:rPr>
           <w:lang w:val="en-US"/>
         </w:rPr>
-        <w:t>The system prevents accidental deletion of active books.</w:t>
+        <w:t>Active books are protected from unintended removal by the system.</w:t>
       </w:r>
     </w:p>
     <w:p>
@@ -6608,7 +8236,7 @@
       </w:pPr>
       <w:r>
         <w:rPr>
-          <w:rStyle w:val="a6"/>
+          <w:rStyle w:val="a7"/>
           <w:b w:val="0"/>
           <w:bCs w:val="0"/>
         </w:rPr>
@@ -6630,7 +8258,16 @@
         <w:rPr>
           <w:lang w:val="en-US"/>
         </w:rPr>
-        <w:t>A book cannot be borrowed if it is already marked as unavailable.</w:t>
+        <w:t>A book with a "Usage" tag cannot be</w:t>
+      </w:r>
+      <w:r>
+        <w:t> </w:t>
+      </w:r>
+      <w:r>
+        <w:rPr>
+          <w:lang w:val="en-US"/>
+        </w:rPr>
+        <w:t>checked out if it is already in use.</w:t>
       </w:r>
     </w:p>
     <w:p>
@@ -6648,7 +8285,16 @@
         <w:rPr>
           <w:lang w:val="en-US"/>
         </w:rPr>
-        <w:t>The system checks whether the book exists and whether it is available before allowing the borrow action.</w:t>
+        <w:t>The application verifies the existence and status of the</w:t>
+      </w:r>
+      <w:r>
+        <w:t> </w:t>
+      </w:r>
+      <w:r>
+        <w:rPr>
+          <w:lang w:val="en-US"/>
+        </w:rPr>
+        <w:t>book before making the borrow operation.</w:t>
       </w:r>
     </w:p>
     <w:p>
@@ -6657,7 +8303,7 @@
       </w:pPr>
       <w:r>
         <w:rPr>
-          <w:rStyle w:val="a6"/>
+          <w:rStyle w:val="a7"/>
           <w:b w:val="0"/>
           <w:bCs w:val="0"/>
         </w:rPr>
@@ -6679,7 +8325,16 @@
         <w:rPr>
           <w:lang w:val="en-US"/>
         </w:rPr>
-        <w:t>A book cannot be returned if it is not borrowed.</w:t>
+        <w:t>An unborrowed book is returned</w:t>
+      </w:r>
+      <w:r>
+        <w:t> </w:t>
+      </w:r>
+      <w:r>
+        <w:rPr>
+          <w:lang w:val="en-US"/>
+        </w:rPr>
+        <w:t>in the wrong place.</w:t>
       </w:r>
     </w:p>
     <w:p>
@@ -6697,7 +8352,16 @@
         <w:rPr>
           <w:lang w:val="en-US"/>
         </w:rPr>
-        <w:t>A book cannot be returned by a member who did not borrow it.</w:t>
+        <w:t>A book can be returned by someone other than the person that</w:t>
+      </w:r>
+      <w:r>
+        <w:t> </w:t>
+      </w:r>
+      <w:r>
+        <w:rPr>
+          <w:lang w:val="en-US"/>
+        </w:rPr>
+        <w:t>borrowed it.</w:t>
       </w:r>
     </w:p>
     <w:p>
@@ -6715,7 +8379,7 @@
         <w:rPr>
           <w:lang w:val="en-US"/>
         </w:rPr>
-        <w:t>These checks ensure correct tracking of borrowing history.</w:t>
+        <w:t>These checks assure that borrowing history tracking is managed correctly.</w:t>
       </w:r>
     </w:p>
     <w:p>
@@ -6724,7 +8388,7 @@
       </w:pPr>
       <w:r>
         <w:rPr>
-          <w:rStyle w:val="a6"/>
+          <w:rStyle w:val="a7"/>
           <w:b w:val="0"/>
           <w:bCs w:val="0"/>
         </w:rPr>
@@ -6746,7 +8410,16 @@
         <w:rPr>
           <w:lang w:val="en-US"/>
         </w:rPr>
-        <w:t>When loading data from the JSON file, the system checks for format errors.</w:t>
+        <w:t>The system</w:t>
+      </w:r>
+      <w:r>
+        <w:t> </w:t>
+      </w:r>
+      <w:r>
+        <w:rPr>
+          <w:lang w:val="en-US"/>
+        </w:rPr>
+        <w:t>now validates the data being loaded from the JSON file.</w:t>
       </w:r>
     </w:p>
     <w:p>
@@ -6764,7 +8437,16 @@
         <w:rPr>
           <w:lang w:val="en-US"/>
         </w:rPr>
-        <w:t>If the file is missing or corrupted, the application safely initializes a new empty file instead of crashing.</w:t>
+        <w:t>In case the file is not present or damaged, it securely re-initializes an empty new file and does</w:t>
+      </w:r>
+      <w:r>
+        <w:t> </w:t>
+      </w:r>
+      <w:r>
+        <w:rPr>
+          <w:lang w:val="en-US"/>
+        </w:rPr>
+        <w:t>not crash.</w:t>
       </w:r>
     </w:p>
     <w:p>
@@ -6823,13 +8505,14 @@
       </w:pPr>
       <w:r>
         <w:rPr>
-          <w:rStyle w:val="a6"/>
+          <w:rStyle w:val="a7"/>
           <w:b/>
           <w:bCs/>
           <w:sz w:val="28"/>
           <w:szCs w:val="28"/>
           <w:lang w:val="en-US"/>
         </w:rPr>
+        <w:lastRenderedPageBreak/>
         <w:t>Limitations</w:t>
       </w:r>
     </w:p>
@@ -6853,7 +8536,7 @@
       </w:pPr>
       <w:r>
         <w:rPr>
-          <w:rStyle w:val="a6"/>
+          <w:rStyle w:val="a7"/>
           <w:b w:val="0"/>
           <w:bCs w:val="0"/>
         </w:rPr>
@@ -6880,7 +8563,7 @@
       </w:pPr>
       <w:r>
         <w:rPr>
-          <w:rStyle w:val="a6"/>
+          <w:rStyle w:val="a7"/>
           <w:b w:val="0"/>
           <w:bCs w:val="0"/>
         </w:rPr>
@@ -6914,7 +8597,7 @@
       </w:pPr>
       <w:r>
         <w:rPr>
-          <w:rStyle w:val="a6"/>
+          <w:rStyle w:val="a7"/>
           <w:b w:val="0"/>
           <w:bCs w:val="0"/>
         </w:rPr>
@@ -6948,7 +8631,7 @@
       </w:pPr>
       <w:r>
         <w:rPr>
-          <w:rStyle w:val="a6"/>
+          <w:rStyle w:val="a7"/>
           <w:b w:val="0"/>
           <w:bCs w:val="0"/>
         </w:rPr>
@@ -6982,7 +8665,7 @@
       </w:pPr>
       <w:r>
         <w:rPr>
-          <w:rStyle w:val="a6"/>
+          <w:rStyle w:val="a7"/>
           <w:b w:val="0"/>
           <w:bCs w:val="0"/>
         </w:rPr>
@@ -7009,7 +8692,7 @@
       </w:pPr>
       <w:r>
         <w:rPr>
-          <w:rStyle w:val="a6"/>
+          <w:rStyle w:val="a7"/>
           <w:b w:val="0"/>
           <w:bCs w:val="0"/>
         </w:rPr>
@@ -7095,7 +8778,7 @@
       <w:pPr>
         <w:pStyle w:val="1"/>
         <w:rPr>
-          <w:rStyle w:val="a6"/>
+          <w:rStyle w:val="a7"/>
           <w:b/>
           <w:bCs/>
           <w:sz w:val="28"/>
@@ -7113,13 +8796,14 @@
       </w:pPr>
       <w:r>
         <w:rPr>
-          <w:rStyle w:val="a6"/>
+          <w:rStyle w:val="a7"/>
           <w:b/>
           <w:bCs/>
           <w:sz w:val="28"/>
           <w:szCs w:val="28"/>
           <w:lang w:val="en-US"/>
         </w:rPr>
+        <w:lastRenderedPageBreak/>
         <w:t>References</w:t>
       </w:r>
     </w:p>
@@ -7153,7 +8837,7 @@
       </w:r>
       <w:r>
         <w:rPr>
-          <w:rStyle w:val="a7"/>
+          <w:rStyle w:val="a8"/>
           <w:lang w:val="en-US"/>
         </w:rPr>
         <w:t>Python Documentation</w:t>
@@ -7164,10 +8848,10 @@
         </w:rPr>
         <w:t xml:space="preserve">. </w:t>
       </w:r>
-      <w:hyperlink r:id="rId6" w:tgtFrame="_new" w:history="1">
+      <w:hyperlink r:id="rId11" w:tgtFrame="_new" w:history="1">
         <w:r>
           <w:rPr>
-            <w:rStyle w:val="a8"/>
+            <w:rStyle w:val="a9"/>
             <w:rFonts w:eastAsiaTheme="majorEastAsia"/>
           </w:rPr>
           <w:t>https://docs.python.org</w:t>
@@ -7190,7 +8874,7 @@
       </w:r>
       <w:r>
         <w:rPr>
-          <w:rStyle w:val="a7"/>
+          <w:rStyle w:val="a8"/>
           <w:lang w:val="en-US"/>
         </w:rPr>
         <w:t>Object-Oriented Programming in Python</w:t>
@@ -7201,10 +8885,10 @@
         </w:rPr>
         <w:t xml:space="preserve">. </w:t>
       </w:r>
-      <w:hyperlink r:id="rId7" w:tgtFrame="_new" w:history="1">
+      <w:hyperlink r:id="rId12" w:tgtFrame="_new" w:history="1">
         <w:r>
           <w:rPr>
-            <w:rStyle w:val="a8"/>
+            <w:rStyle w:val="a9"/>
             <w:rFonts w:eastAsiaTheme="majorEastAsia"/>
           </w:rPr>
           <w:t>https://realpython.com</w:t>
@@ -7227,7 +8911,7 @@
       </w:r>
       <w:r>
         <w:rPr>
-          <w:rStyle w:val="a7"/>
+          <w:rStyle w:val="a8"/>
           <w:lang w:val="en-US"/>
         </w:rPr>
         <w:t>Python File Handling Tutorial</w:t>
@@ -7238,10 +8922,10 @@
         </w:rPr>
         <w:t xml:space="preserve">. </w:t>
       </w:r>
-      <w:hyperlink r:id="rId8" w:tgtFrame="_new" w:history="1">
+      <w:hyperlink r:id="rId13" w:tgtFrame="_new" w:history="1">
         <w:r>
           <w:rPr>
-            <w:rStyle w:val="a8"/>
+            <w:rStyle w:val="a9"/>
             <w:rFonts w:eastAsiaTheme="majorEastAsia"/>
           </w:rPr>
           <w:t>https://www.w3schools.com/python</w:t>
@@ -7256,15 +8940,23 @@
           <w:numId w:val="23"/>
         </w:numPr>
       </w:pPr>
-      <w:r>
-        <w:rPr>
-          <w:lang w:val="en-US"/>
-        </w:rPr>
-        <w:t xml:space="preserve">GeeksforGeeks. </w:t>
-      </w:r>
-      <w:r>
-        <w:rPr>
-          <w:rStyle w:val="a7"/>
+      <w:proofErr w:type="spellStart"/>
+      <w:r>
+        <w:rPr>
+          <w:lang w:val="en-US"/>
+        </w:rPr>
+        <w:t>GeeksforGeeks</w:t>
+      </w:r>
+      <w:proofErr w:type="spellEnd"/>
+      <w:r>
+        <w:rPr>
+          <w:lang w:val="en-US"/>
+        </w:rPr>
+        <w:t xml:space="preserve">. </w:t>
+      </w:r>
+      <w:r>
+        <w:rPr>
+          <w:rStyle w:val="a8"/>
           <w:lang w:val="en-US"/>
         </w:rPr>
         <w:t>Python Classes and Objects</w:t>
@@ -7275,10 +8967,10 @@
         </w:rPr>
         <w:t xml:space="preserve">. </w:t>
       </w:r>
-      <w:hyperlink r:id="rId9" w:tgtFrame="_new" w:history="1">
+      <w:hyperlink r:id="rId14" w:tgtFrame="_new" w:history="1">
         <w:r>
           <w:rPr>
-            <w:rStyle w:val="a8"/>
+            <w:rStyle w:val="a9"/>
             <w:rFonts w:eastAsiaTheme="majorEastAsia"/>
           </w:rPr>
           <w:t>https://www.geeksforgeeks.org</w:t>
@@ -7301,6 +8993,48 @@
           <w:lang w:val="en-US"/>
         </w:rPr>
         <w:t>Stack Overflow discussions on Python coding practices and error handling.</w:t>
+      </w:r>
+    </w:p>
+    <w:p>
+      <w:pPr>
+        <w:pStyle w:val="a5"/>
+        <w:rPr>
+          <w:lang w:val="en-US"/>
+        </w:rPr>
+      </w:pPr>
+      <w:r>
+        <w:rPr>
+          <w:lang w:val="en-US"/>
+        </w:rPr>
+        <w:t>I also used Git as a version control system, which helped me track changes, organize the workflow, and work more efficiently throughout the development process.</w:t>
+      </w:r>
+    </w:p>
+    <w:p>
+      <w:pPr>
+        <w:pStyle w:val="a5"/>
+        <w:rPr>
+          <w:lang w:val="en-US"/>
+        </w:rPr>
+      </w:pPr>
+      <w:r>
+        <w:rPr>
+          <w:lang w:val="en-US"/>
+        </w:rPr>
+        <w:t>Git repository:</w:t>
+      </w:r>
+    </w:p>
+    <w:p>
+      <w:pPr>
+        <w:pStyle w:val="a5"/>
+        <w:rPr>
+          <w:lang w:val="en-US"/>
+        </w:rPr>
+      </w:pPr>
+      <w:r>
+        <w:rPr>
+          <w:lang w:val="en-US"/>
+        </w:rPr>
+        <w:t>https://github.com/Kyrsadak/Programming_Concepts_and_Application_Development_Final_Project</w:t>
       </w:r>
     </w:p>
     <w:p>
@@ -7339,6 +9073,92 @@
 <file path=word/numbering.xml><?xml version="1.0" encoding="utf-8"?>
 <w:numbering xmlns:wpc="http://schemas.microsoft.com/office/word/2010/wordprocessingCanvas" xmlns:cx="http://schemas.microsoft.com/office/drawing/2014/chartex" xmlns:cx1="http://schemas.microsoft.com/office/drawing/2015/9/8/chartex" xmlns:cx2="http://schemas.microsoft.com/office/drawing/2015/10/21/chartex" xmlns:cx3="http://schemas.microsoft.com/office/drawing/2016/5/9/chartex" xmlns:cx4="http://schemas.microsoft.com/office/drawing/2016/5/10/chartex" xmlns:cx5="http://schemas.microsoft.com/office/drawing/2016/5/11/chartex" xmlns:cx6="http://schemas.microsoft.com/office/drawing/2016/5/12/chartex" xmlns:cx7="http://schemas.microsoft.com/office/drawing/2016/5/13/chartex" xmlns:cx8="http://schemas.microsoft.com/office/drawing/2016/5/14/chartex" xmlns:mc="http://schemas.openxmlformats.org/markup-compatibility/2006" xmlns:aink="http://schemas.microsoft.com/office/drawing/2016/ink" xmlns:am3d="http://schemas.microsoft.com/office/drawing/2017/model3d" xmlns:o="urn:schemas-microsoft-com:office:office" xmlns:r="http://schemas.openxmlformats.org/officeDocument/2006/relationships" xmlns:m="http://schemas.openxmlformats.org/officeDocument/2006/math" xmlns:v="urn:schemas-microsoft-com:vml" xmlns:wp14="http://schemas.microsoft.com/office/word/2010/wordprocessingDrawing" xmlns:wp="http://schemas.openxmlformats.org/drawingml/2006/wordprocessingDrawing" xmlns:w10="urn:schemas-microsoft-com:office:word" xmlns:w="http://schemas.openxmlformats.org/wordprocessingml/2006/main" xmlns:w14="http://schemas.microsoft.com/office/word/2010/wordml" xmlns:w15="http://schemas.microsoft.com/office/word/2012/wordml" xmlns:w16cex="http://schemas.microsoft.com/office/word/2018/wordml/cex" xmlns:w16cid="http://schemas.microsoft.com/office/word/2016/wordml/cid" xmlns:w16="http://schemas.microsoft.com/office/word/2018/wordml" xmlns:w16sdtdh="http://schemas.microsoft.com/office/word/2020/wordml/sdtdatahash" xmlns:w16se="http://schemas.microsoft.com/office/word/2015/wordml/symex" xmlns:wpg="http://schemas.microsoft.com/office/word/2010/wordprocessingGroup" xmlns:wpi="http://schemas.microsoft.com/office/word/2010/wordprocessingInk" xmlns:wne="http://schemas.microsoft.com/office/word/2006/wordml" xmlns:wps="http://schemas.microsoft.com/office/word/2010/wordprocessingShape" mc:Ignorable="w14 w15 w16se w16cid w16 w16cex w16sdtdh wp14">
   <w:abstractNum w:abstractNumId="0" w15:restartNumberingAfterBreak="0">
+    <w:nsid w:val="01CC1085"/>
+    <w:multiLevelType w:val="hybridMultilevel"/>
+    <w:tmpl w:val="C742B9E6"/>
+    <w:lvl w:ilvl="0" w:tplc="04190011">
+      <w:start w:val="1"/>
+      <w:numFmt w:val="decimal"/>
+      <w:lvlText w:val="%1)"/>
+      <w:lvlJc w:val="left"/>
+      <w:pPr>
+        <w:ind w:left="720" w:hanging="360"/>
+      </w:pPr>
+    </w:lvl>
+    <w:lvl w:ilvl="1" w:tplc="04190019" w:tentative="1">
+      <w:start w:val="1"/>
+      <w:numFmt w:val="lowerLetter"/>
+      <w:lvlText w:val="%2."/>
+      <w:lvlJc w:val="left"/>
+      <w:pPr>
+        <w:ind w:left="1440" w:hanging="360"/>
+      </w:pPr>
+    </w:lvl>
+    <w:lvl w:ilvl="2" w:tplc="0419001B" w:tentative="1">
+      <w:start w:val="1"/>
+      <w:numFmt w:val="lowerRoman"/>
+      <w:lvlText w:val="%3."/>
+      <w:lvlJc w:val="right"/>
+      <w:pPr>
+        <w:ind w:left="2160" w:hanging="180"/>
+      </w:pPr>
+    </w:lvl>
+    <w:lvl w:ilvl="3" w:tplc="0419000F" w:tentative="1">
+      <w:start w:val="1"/>
+      <w:numFmt w:val="decimal"/>
+      <w:lvlText w:val="%4."/>
+      <w:lvlJc w:val="left"/>
+      <w:pPr>
+        <w:ind w:left="2880" w:hanging="360"/>
+      </w:pPr>
+    </w:lvl>
+    <w:lvl w:ilvl="4" w:tplc="04190019" w:tentative="1">
+      <w:start w:val="1"/>
+      <w:numFmt w:val="lowerLetter"/>
+      <w:lvlText w:val="%5."/>
+      <w:lvlJc w:val="left"/>
+      <w:pPr>
+        <w:ind w:left="3600" w:hanging="360"/>
+      </w:pPr>
+    </w:lvl>
+    <w:lvl w:ilvl="5" w:tplc="0419001B" w:tentative="1">
+      <w:start w:val="1"/>
+      <w:numFmt w:val="lowerRoman"/>
+      <w:lvlText w:val="%6."/>
+      <w:lvlJc w:val="right"/>
+      <w:pPr>
+        <w:ind w:left="4320" w:hanging="180"/>
+      </w:pPr>
+    </w:lvl>
+    <w:lvl w:ilvl="6" w:tplc="0419000F" w:tentative="1">
+      <w:start w:val="1"/>
+      <w:numFmt w:val="decimal"/>
+      <w:lvlText w:val="%7."/>
+      <w:lvlJc w:val="left"/>
+      <w:pPr>
+        <w:ind w:left="5040" w:hanging="360"/>
+      </w:pPr>
+    </w:lvl>
+    <w:lvl w:ilvl="7" w:tplc="04190019" w:tentative="1">
+      <w:start w:val="1"/>
+      <w:numFmt w:val="lowerLetter"/>
+      <w:lvlText w:val="%8."/>
+      <w:lvlJc w:val="left"/>
+      <w:pPr>
+        <w:ind w:left="5760" w:hanging="360"/>
+      </w:pPr>
+    </w:lvl>
+    <w:lvl w:ilvl="8" w:tplc="0419001B" w:tentative="1">
+      <w:start w:val="1"/>
+      <w:numFmt w:val="lowerRoman"/>
+      <w:lvlText w:val="%9."/>
+      <w:lvlJc w:val="right"/>
+      <w:pPr>
+        <w:ind w:left="6480" w:hanging="180"/>
+      </w:pPr>
+    </w:lvl>
+  </w:abstractNum>
+  <w:abstractNum w:abstractNumId="1" w15:restartNumberingAfterBreak="0">
     <w:nsid w:val="01FD7121"/>
     <w:multiLevelType w:val="hybridMultilevel"/>
     <w:tmpl w:val="AFE09C48"/>
@@ -7427,7 +9247,7 @@
       </w:pPr>
     </w:lvl>
   </w:abstractNum>
-  <w:abstractNum w:abstractNumId="1" w15:restartNumberingAfterBreak="0">
+  <w:abstractNum w:abstractNumId="2" w15:restartNumberingAfterBreak="0">
     <w:nsid w:val="02AF1295"/>
     <w:multiLevelType w:val="hybridMultilevel"/>
     <w:tmpl w:val="4358FEDE"/>
@@ -7540,7 +9360,7 @@
       </w:rPr>
     </w:lvl>
   </w:abstractNum>
-  <w:abstractNum w:abstractNumId="2" w15:restartNumberingAfterBreak="0">
+  <w:abstractNum w:abstractNumId="3" w15:restartNumberingAfterBreak="0">
     <w:nsid w:val="074A4DAD"/>
     <w:multiLevelType w:val="multilevel"/>
     <w:tmpl w:val="3E1AD2AA"/>
@@ -7689,7 +9509,7 @@
       </w:rPr>
     </w:lvl>
   </w:abstractNum>
-  <w:abstractNum w:abstractNumId="3" w15:restartNumberingAfterBreak="0">
+  <w:abstractNum w:abstractNumId="4" w15:restartNumberingAfterBreak="0">
     <w:nsid w:val="07C4244E"/>
     <w:multiLevelType w:val="multilevel"/>
     <w:tmpl w:val="1DC69460"/>
@@ -7838,7 +9658,7 @@
       </w:rPr>
     </w:lvl>
   </w:abstractNum>
-  <w:abstractNum w:abstractNumId="4" w15:restartNumberingAfterBreak="0">
+  <w:abstractNum w:abstractNumId="5" w15:restartNumberingAfterBreak="0">
     <w:nsid w:val="0D9F3323"/>
     <w:multiLevelType w:val="multilevel"/>
     <w:tmpl w:val="05B68084"/>
@@ -7951,7 +9771,7 @@
       </w:pPr>
     </w:lvl>
   </w:abstractNum>
-  <w:abstractNum w:abstractNumId="5" w15:restartNumberingAfterBreak="0">
+  <w:abstractNum w:abstractNumId="6" w15:restartNumberingAfterBreak="0">
     <w:nsid w:val="0E934057"/>
     <w:multiLevelType w:val="multilevel"/>
     <w:tmpl w:val="D55E11F6"/>
@@ -8096,7 +9916,7 @@
       </w:rPr>
     </w:lvl>
   </w:abstractNum>
-  <w:abstractNum w:abstractNumId="6" w15:restartNumberingAfterBreak="0">
+  <w:abstractNum w:abstractNumId="7" w15:restartNumberingAfterBreak="0">
     <w:nsid w:val="165A35B3"/>
     <w:multiLevelType w:val="hybridMultilevel"/>
     <w:tmpl w:val="92A67036"/>
@@ -8209,10 +10029,10 @@
       </w:rPr>
     </w:lvl>
   </w:abstractNum>
-  <w:abstractNum w:abstractNumId="7" w15:restartNumberingAfterBreak="0">
+  <w:abstractNum w:abstractNumId="8" w15:restartNumberingAfterBreak="0">
     <w:nsid w:val="18CC02A2"/>
     <w:multiLevelType w:val="hybridMultilevel"/>
-    <w:tmpl w:val="1636910C"/>
+    <w:tmpl w:val="4874E070"/>
     <w:lvl w:ilvl="0" w:tplc="0419000F">
       <w:start w:val="1"/>
       <w:numFmt w:val="decimal"/>
@@ -8225,14 +10045,16 @@
         <w:rFonts w:hint="default"/>
       </w:rPr>
     </w:lvl>
-    <w:lvl w:ilvl="1" w:tplc="04190019" w:tentative="1">
-      <w:start w:val="1"/>
-      <w:numFmt w:val="lowerLetter"/>
-      <w:lvlText w:val="%2."/>
+    <w:lvl w:ilvl="1" w:tplc="AAB21DDE">
+      <w:numFmt w:val="bullet"/>
+      <w:lvlText w:val="·"/>
       <w:lvlJc w:val="left"/>
       <w:pPr>
         <w:ind w:left="1440" w:hanging="360"/>
       </w:pPr>
+      <w:rPr>
+        <w:rFonts w:ascii="Times New Roman" w:eastAsia="Times New Roman" w:hAnsi="Times New Roman" w:cs="Times New Roman" w:hint="default"/>
+      </w:rPr>
     </w:lvl>
     <w:lvl w:ilvl="2" w:tplc="0419001B" w:tentative="1">
       <w:start w:val="1"/>
@@ -8298,7 +10120,7 @@
       </w:pPr>
     </w:lvl>
   </w:abstractNum>
-  <w:abstractNum w:abstractNumId="8" w15:restartNumberingAfterBreak="0">
+  <w:abstractNum w:abstractNumId="9" w15:restartNumberingAfterBreak="0">
     <w:nsid w:val="18FD4E66"/>
     <w:multiLevelType w:val="multilevel"/>
     <w:tmpl w:val="DF22C3B6"/>
@@ -8447,7 +10269,7 @@
       </w:rPr>
     </w:lvl>
   </w:abstractNum>
-  <w:abstractNum w:abstractNumId="9" w15:restartNumberingAfterBreak="0">
+  <w:abstractNum w:abstractNumId="10" w15:restartNumberingAfterBreak="0">
     <w:nsid w:val="207D0B82"/>
     <w:multiLevelType w:val="multilevel"/>
     <w:tmpl w:val="6AE8DC74"/>
@@ -8596,7 +10418,7 @@
       </w:rPr>
     </w:lvl>
   </w:abstractNum>
-  <w:abstractNum w:abstractNumId="10" w15:restartNumberingAfterBreak="0">
+  <w:abstractNum w:abstractNumId="11" w15:restartNumberingAfterBreak="0">
     <w:nsid w:val="22927FA2"/>
     <w:multiLevelType w:val="multilevel"/>
     <w:tmpl w:val="861EB7DA"/>
@@ -8709,7 +10531,120 @@
       </w:pPr>
     </w:lvl>
   </w:abstractNum>
-  <w:abstractNum w:abstractNumId="11" w15:restartNumberingAfterBreak="0">
+  <w:abstractNum w:abstractNumId="12" w15:restartNumberingAfterBreak="0">
+    <w:nsid w:val="242F4AFB"/>
+    <w:multiLevelType w:val="hybridMultilevel"/>
+    <w:tmpl w:val="90442084"/>
+    <w:lvl w:ilvl="0" w:tplc="04190001">
+      <w:start w:val="1"/>
+      <w:numFmt w:val="bullet"/>
+      <w:lvlText w:val=""/>
+      <w:lvlJc w:val="left"/>
+      <w:pPr>
+        <w:ind w:left="720" w:hanging="360"/>
+      </w:pPr>
+      <w:rPr>
+        <w:rFonts w:ascii="Symbol" w:hAnsi="Symbol" w:hint="default"/>
+      </w:rPr>
+    </w:lvl>
+    <w:lvl w:ilvl="1" w:tplc="04190003" w:tentative="1">
+      <w:start w:val="1"/>
+      <w:numFmt w:val="bullet"/>
+      <w:lvlText w:val="o"/>
+      <w:lvlJc w:val="left"/>
+      <w:pPr>
+        <w:ind w:left="1440" w:hanging="360"/>
+      </w:pPr>
+      <w:rPr>
+        <w:rFonts w:ascii="Courier New" w:hAnsi="Courier New" w:cs="Courier New" w:hint="default"/>
+      </w:rPr>
+    </w:lvl>
+    <w:lvl w:ilvl="2" w:tplc="04190005" w:tentative="1">
+      <w:start w:val="1"/>
+      <w:numFmt w:val="bullet"/>
+      <w:lvlText w:val=""/>
+      <w:lvlJc w:val="left"/>
+      <w:pPr>
+        <w:ind w:left="2160" w:hanging="360"/>
+      </w:pPr>
+      <w:rPr>
+        <w:rFonts w:ascii="Wingdings" w:hAnsi="Wingdings" w:hint="default"/>
+      </w:rPr>
+    </w:lvl>
+    <w:lvl w:ilvl="3" w:tplc="04190001" w:tentative="1">
+      <w:start w:val="1"/>
+      <w:numFmt w:val="bullet"/>
+      <w:lvlText w:val=""/>
+      <w:lvlJc w:val="left"/>
+      <w:pPr>
+        <w:ind w:left="2880" w:hanging="360"/>
+      </w:pPr>
+      <w:rPr>
+        <w:rFonts w:ascii="Symbol" w:hAnsi="Symbol" w:hint="default"/>
+      </w:rPr>
+    </w:lvl>
+    <w:lvl w:ilvl="4" w:tplc="04190003" w:tentative="1">
+      <w:start w:val="1"/>
+      <w:numFmt w:val="bullet"/>
+      <w:lvlText w:val="o"/>
+      <w:lvlJc w:val="left"/>
+      <w:pPr>
+        <w:ind w:left="3600" w:hanging="360"/>
+      </w:pPr>
+      <w:rPr>
+        <w:rFonts w:ascii="Courier New" w:hAnsi="Courier New" w:cs="Courier New" w:hint="default"/>
+      </w:rPr>
+    </w:lvl>
+    <w:lvl w:ilvl="5" w:tplc="04190005" w:tentative="1">
+      <w:start w:val="1"/>
+      <w:numFmt w:val="bullet"/>
+      <w:lvlText w:val=""/>
+      <w:lvlJc w:val="left"/>
+      <w:pPr>
+        <w:ind w:left="4320" w:hanging="360"/>
+      </w:pPr>
+      <w:rPr>
+        <w:rFonts w:ascii="Wingdings" w:hAnsi="Wingdings" w:hint="default"/>
+      </w:rPr>
+    </w:lvl>
+    <w:lvl w:ilvl="6" w:tplc="04190001" w:tentative="1">
+      <w:start w:val="1"/>
+      <w:numFmt w:val="bullet"/>
+      <w:lvlText w:val=""/>
+      <w:lvlJc w:val="left"/>
+      <w:pPr>
+        <w:ind w:left="5040" w:hanging="360"/>
+      </w:pPr>
+      <w:rPr>
+        <w:rFonts w:ascii="Symbol" w:hAnsi="Symbol" w:hint="default"/>
+      </w:rPr>
+    </w:lvl>
+    <w:lvl w:ilvl="7" w:tplc="04190003" w:tentative="1">
+      <w:start w:val="1"/>
+      <w:numFmt w:val="bullet"/>
+      <w:lvlText w:val="o"/>
+      <w:lvlJc w:val="left"/>
+      <w:pPr>
+        <w:ind w:left="5760" w:hanging="360"/>
+      </w:pPr>
+      <w:rPr>
+        <w:rFonts w:ascii="Courier New" w:hAnsi="Courier New" w:cs="Courier New" w:hint="default"/>
+      </w:rPr>
+    </w:lvl>
+    <w:lvl w:ilvl="8" w:tplc="04190005" w:tentative="1">
+      <w:start w:val="1"/>
+      <w:numFmt w:val="bullet"/>
+      <w:lvlText w:val=""/>
+      <w:lvlJc w:val="left"/>
+      <w:pPr>
+        <w:ind w:left="6480" w:hanging="360"/>
+      </w:pPr>
+      <w:rPr>
+        <w:rFonts w:ascii="Wingdings" w:hAnsi="Wingdings" w:hint="default"/>
+      </w:rPr>
+    </w:lvl>
+  </w:abstractNum>
+  <w:abstractNum w:abstractNumId="13" w15:restartNumberingAfterBreak="0">
     <w:nsid w:val="2E59583F"/>
     <w:multiLevelType w:val="multilevel"/>
     <w:tmpl w:val="64800970"/>
@@ -8858,7 +10793,7 @@
       </w:rPr>
     </w:lvl>
   </w:abstractNum>
-  <w:abstractNum w:abstractNumId="12" w15:restartNumberingAfterBreak="0">
+  <w:abstractNum w:abstractNumId="14" w15:restartNumberingAfterBreak="0">
     <w:nsid w:val="2E8C5EF6"/>
     <w:multiLevelType w:val="multilevel"/>
     <w:tmpl w:val="89C27378"/>
@@ -8971,7 +10906,7 @@
       </w:pPr>
     </w:lvl>
   </w:abstractNum>
-  <w:abstractNum w:abstractNumId="13" w15:restartNumberingAfterBreak="0">
+  <w:abstractNum w:abstractNumId="15" w15:restartNumberingAfterBreak="0">
     <w:nsid w:val="44373A36"/>
     <w:multiLevelType w:val="multilevel"/>
     <w:tmpl w:val="C19AE292"/>
@@ -9120,7 +11055,7 @@
       </w:rPr>
     </w:lvl>
   </w:abstractNum>
-  <w:abstractNum w:abstractNumId="14" w15:restartNumberingAfterBreak="0">
+  <w:abstractNum w:abstractNumId="16" w15:restartNumberingAfterBreak="0">
     <w:nsid w:val="48FA55E8"/>
     <w:multiLevelType w:val="multilevel"/>
     <w:tmpl w:val="D85E447A"/>
@@ -9269,7 +11204,7 @@
       </w:rPr>
     </w:lvl>
   </w:abstractNum>
-  <w:abstractNum w:abstractNumId="15" w15:restartNumberingAfterBreak="0">
+  <w:abstractNum w:abstractNumId="17" w15:restartNumberingAfterBreak="0">
     <w:nsid w:val="50CB469A"/>
     <w:multiLevelType w:val="multilevel"/>
     <w:tmpl w:val="96F25B10"/>
@@ -9418,7 +11353,7 @@
       </w:rPr>
     </w:lvl>
   </w:abstractNum>
-  <w:abstractNum w:abstractNumId="16" w15:restartNumberingAfterBreak="0">
+  <w:abstractNum w:abstractNumId="18" w15:restartNumberingAfterBreak="0">
     <w:nsid w:val="54FF720A"/>
     <w:multiLevelType w:val="multilevel"/>
     <w:tmpl w:val="5A4210AC"/>
@@ -9531,7 +11466,7 @@
       </w:pPr>
     </w:lvl>
   </w:abstractNum>
-  <w:abstractNum w:abstractNumId="17" w15:restartNumberingAfterBreak="0">
+  <w:abstractNum w:abstractNumId="19" w15:restartNumberingAfterBreak="0">
     <w:nsid w:val="593A5276"/>
     <w:multiLevelType w:val="hybridMultilevel"/>
     <w:tmpl w:val="4CFCE7BE"/>
@@ -9620,7 +11555,7 @@
       </w:pPr>
     </w:lvl>
   </w:abstractNum>
-  <w:abstractNum w:abstractNumId="18" w15:restartNumberingAfterBreak="0">
+  <w:abstractNum w:abstractNumId="20" w15:restartNumberingAfterBreak="0">
     <w:nsid w:val="5C434BFA"/>
     <w:multiLevelType w:val="multilevel"/>
     <w:tmpl w:val="EE20C7A4"/>
@@ -9769,7 +11704,7 @@
       </w:rPr>
     </w:lvl>
   </w:abstractNum>
-  <w:abstractNum w:abstractNumId="19" w15:restartNumberingAfterBreak="0">
+  <w:abstractNum w:abstractNumId="21" w15:restartNumberingAfterBreak="0">
     <w:nsid w:val="5CB26638"/>
     <w:multiLevelType w:val="multilevel"/>
     <w:tmpl w:val="6122E2AC"/>
@@ -9882,7 +11817,7 @@
       </w:pPr>
     </w:lvl>
   </w:abstractNum>
-  <w:abstractNum w:abstractNumId="20" w15:restartNumberingAfterBreak="0">
+  <w:abstractNum w:abstractNumId="22" w15:restartNumberingAfterBreak="0">
     <w:nsid w:val="5CD17E5F"/>
     <w:multiLevelType w:val="multilevel"/>
     <w:tmpl w:val="D1BE2406"/>
@@ -10031,7 +11966,209 @@
       </w:rPr>
     </w:lvl>
   </w:abstractNum>
-  <w:abstractNum w:abstractNumId="21" w15:restartNumberingAfterBreak="0">
+  <w:abstractNum w:abstractNumId="23" w15:restartNumberingAfterBreak="0">
+    <w:nsid w:val="6080598B"/>
+    <w:multiLevelType w:val="hybridMultilevel"/>
+    <w:tmpl w:val="CA8004FA"/>
+    <w:lvl w:ilvl="0" w:tplc="04190001">
+      <w:start w:val="1"/>
+      <w:numFmt w:val="bullet"/>
+      <w:lvlText w:val=""/>
+      <w:lvlJc w:val="left"/>
+      <w:pPr>
+        <w:ind w:left="1800" w:hanging="360"/>
+      </w:pPr>
+      <w:rPr>
+        <w:rFonts w:ascii="Symbol" w:hAnsi="Symbol" w:hint="default"/>
+      </w:rPr>
+    </w:lvl>
+    <w:lvl w:ilvl="1" w:tplc="04190003" w:tentative="1">
+      <w:start w:val="1"/>
+      <w:numFmt w:val="bullet"/>
+      <w:lvlText w:val="o"/>
+      <w:lvlJc w:val="left"/>
+      <w:pPr>
+        <w:ind w:left="2520" w:hanging="360"/>
+      </w:pPr>
+      <w:rPr>
+        <w:rFonts w:ascii="Courier New" w:hAnsi="Courier New" w:cs="Courier New" w:hint="default"/>
+      </w:rPr>
+    </w:lvl>
+    <w:lvl w:ilvl="2" w:tplc="04190005" w:tentative="1">
+      <w:start w:val="1"/>
+      <w:numFmt w:val="bullet"/>
+      <w:lvlText w:val=""/>
+      <w:lvlJc w:val="left"/>
+      <w:pPr>
+        <w:ind w:left="3240" w:hanging="360"/>
+      </w:pPr>
+      <w:rPr>
+        <w:rFonts w:ascii="Wingdings" w:hAnsi="Wingdings" w:hint="default"/>
+      </w:rPr>
+    </w:lvl>
+    <w:lvl w:ilvl="3" w:tplc="04190001" w:tentative="1">
+      <w:start w:val="1"/>
+      <w:numFmt w:val="bullet"/>
+      <w:lvlText w:val=""/>
+      <w:lvlJc w:val="left"/>
+      <w:pPr>
+        <w:ind w:left="3960" w:hanging="360"/>
+      </w:pPr>
+      <w:rPr>
+        <w:rFonts w:ascii="Symbol" w:hAnsi="Symbol" w:hint="default"/>
+      </w:rPr>
+    </w:lvl>
+    <w:lvl w:ilvl="4" w:tplc="04190003" w:tentative="1">
+      <w:start w:val="1"/>
+      <w:numFmt w:val="bullet"/>
+      <w:lvlText w:val="o"/>
+      <w:lvlJc w:val="left"/>
+      <w:pPr>
+        <w:ind w:left="4680" w:hanging="360"/>
+      </w:pPr>
+      <w:rPr>
+        <w:rFonts w:ascii="Courier New" w:hAnsi="Courier New" w:cs="Courier New" w:hint="default"/>
+      </w:rPr>
+    </w:lvl>
+    <w:lvl w:ilvl="5" w:tplc="04190005" w:tentative="1">
+      <w:start w:val="1"/>
+      <w:numFmt w:val="bullet"/>
+      <w:lvlText w:val=""/>
+      <w:lvlJc w:val="left"/>
+      <w:pPr>
+        <w:ind w:left="5400" w:hanging="360"/>
+      </w:pPr>
+      <w:rPr>
+        <w:rFonts w:ascii="Wingdings" w:hAnsi="Wingdings" w:hint="default"/>
+      </w:rPr>
+    </w:lvl>
+    <w:lvl w:ilvl="6" w:tplc="04190001" w:tentative="1">
+      <w:start w:val="1"/>
+      <w:numFmt w:val="bullet"/>
+      <w:lvlText w:val=""/>
+      <w:lvlJc w:val="left"/>
+      <w:pPr>
+        <w:ind w:left="6120" w:hanging="360"/>
+      </w:pPr>
+      <w:rPr>
+        <w:rFonts w:ascii="Symbol" w:hAnsi="Symbol" w:hint="default"/>
+      </w:rPr>
+    </w:lvl>
+    <w:lvl w:ilvl="7" w:tplc="04190003" w:tentative="1">
+      <w:start w:val="1"/>
+      <w:numFmt w:val="bullet"/>
+      <w:lvlText w:val="o"/>
+      <w:lvlJc w:val="left"/>
+      <w:pPr>
+        <w:ind w:left="6840" w:hanging="360"/>
+      </w:pPr>
+      <w:rPr>
+        <w:rFonts w:ascii="Courier New" w:hAnsi="Courier New" w:cs="Courier New" w:hint="default"/>
+      </w:rPr>
+    </w:lvl>
+    <w:lvl w:ilvl="8" w:tplc="04190005" w:tentative="1">
+      <w:start w:val="1"/>
+      <w:numFmt w:val="bullet"/>
+      <w:lvlText w:val=""/>
+      <w:lvlJc w:val="left"/>
+      <w:pPr>
+        <w:ind w:left="7560" w:hanging="360"/>
+      </w:pPr>
+      <w:rPr>
+        <w:rFonts w:ascii="Wingdings" w:hAnsi="Wingdings" w:hint="default"/>
+      </w:rPr>
+    </w:lvl>
+  </w:abstractNum>
+  <w:abstractNum w:abstractNumId="24" w15:restartNumberingAfterBreak="0">
+    <w:nsid w:val="62D007A2"/>
+    <w:multiLevelType w:val="hybridMultilevel"/>
+    <w:tmpl w:val="06D2168A"/>
+    <w:lvl w:ilvl="0" w:tplc="04190011">
+      <w:start w:val="1"/>
+      <w:numFmt w:val="decimal"/>
+      <w:lvlText w:val="%1)"/>
+      <w:lvlJc w:val="left"/>
+      <w:pPr>
+        <w:ind w:left="720" w:hanging="360"/>
+      </w:pPr>
+      <w:rPr>
+        <w:rFonts w:hint="default"/>
+      </w:rPr>
+    </w:lvl>
+    <w:lvl w:ilvl="1" w:tplc="04190019" w:tentative="1">
+      <w:start w:val="1"/>
+      <w:numFmt w:val="lowerLetter"/>
+      <w:lvlText w:val="%2."/>
+      <w:lvlJc w:val="left"/>
+      <w:pPr>
+        <w:ind w:left="1440" w:hanging="360"/>
+      </w:pPr>
+    </w:lvl>
+    <w:lvl w:ilvl="2" w:tplc="0419001B" w:tentative="1">
+      <w:start w:val="1"/>
+      <w:numFmt w:val="lowerRoman"/>
+      <w:lvlText w:val="%3."/>
+      <w:lvlJc w:val="right"/>
+      <w:pPr>
+        <w:ind w:left="2160" w:hanging="180"/>
+      </w:pPr>
+    </w:lvl>
+    <w:lvl w:ilvl="3" w:tplc="0419000F" w:tentative="1">
+      <w:start w:val="1"/>
+      <w:numFmt w:val="decimal"/>
+      <w:lvlText w:val="%4."/>
+      <w:lvlJc w:val="left"/>
+      <w:pPr>
+        <w:ind w:left="2880" w:hanging="360"/>
+      </w:pPr>
+    </w:lvl>
+    <w:lvl w:ilvl="4" w:tplc="04190019" w:tentative="1">
+      <w:start w:val="1"/>
+      <w:numFmt w:val="lowerLetter"/>
+      <w:lvlText w:val="%5."/>
+      <w:lvlJc w:val="left"/>
+      <w:pPr>
+        <w:ind w:left="3600" w:hanging="360"/>
+      </w:pPr>
+    </w:lvl>
+    <w:lvl w:ilvl="5" w:tplc="0419001B" w:tentative="1">
+      <w:start w:val="1"/>
+      <w:numFmt w:val="lowerRoman"/>
+      <w:lvlText w:val="%6."/>
+      <w:lvlJc w:val="right"/>
+      <w:pPr>
+        <w:ind w:left="4320" w:hanging="180"/>
+      </w:pPr>
+    </w:lvl>
+    <w:lvl w:ilvl="6" w:tplc="0419000F" w:tentative="1">
+      <w:start w:val="1"/>
+      <w:numFmt w:val="decimal"/>
+      <w:lvlText w:val="%7."/>
+      <w:lvlJc w:val="left"/>
+      <w:pPr>
+        <w:ind w:left="5040" w:hanging="360"/>
+      </w:pPr>
+    </w:lvl>
+    <w:lvl w:ilvl="7" w:tplc="04190019" w:tentative="1">
+      <w:start w:val="1"/>
+      <w:numFmt w:val="lowerLetter"/>
+      <w:lvlText w:val="%8."/>
+      <w:lvlJc w:val="left"/>
+      <w:pPr>
+        <w:ind w:left="5760" w:hanging="360"/>
+      </w:pPr>
+    </w:lvl>
+    <w:lvl w:ilvl="8" w:tplc="0419001B" w:tentative="1">
+      <w:start w:val="1"/>
+      <w:numFmt w:val="lowerRoman"/>
+      <w:lvlText w:val="%9."/>
+      <w:lvlJc w:val="right"/>
+      <w:pPr>
+        <w:ind w:left="6480" w:hanging="180"/>
+      </w:pPr>
+    </w:lvl>
+  </w:abstractNum>
+  <w:abstractNum w:abstractNumId="25" w15:restartNumberingAfterBreak="0">
     <w:nsid w:val="69470709"/>
     <w:multiLevelType w:val="multilevel"/>
     <w:tmpl w:val="12DA8B3C"/>
@@ -10144,7 +12281,7 @@
       </w:pPr>
     </w:lvl>
   </w:abstractNum>
-  <w:abstractNum w:abstractNumId="22" w15:restartNumberingAfterBreak="0">
+  <w:abstractNum w:abstractNumId="26" w15:restartNumberingAfterBreak="0">
     <w:nsid w:val="6D23313E"/>
     <w:multiLevelType w:val="multilevel"/>
     <w:tmpl w:val="9A564C5C"/>
@@ -10293,7 +12430,7 @@
       </w:rPr>
     </w:lvl>
   </w:abstractNum>
-  <w:abstractNum w:abstractNumId="23" w15:restartNumberingAfterBreak="0">
+  <w:abstractNum w:abstractNumId="27" w15:restartNumberingAfterBreak="0">
     <w:nsid w:val="6D2D20AE"/>
     <w:multiLevelType w:val="hybridMultilevel"/>
     <w:tmpl w:val="90F69358"/>
@@ -10383,7 +12520,7 @@
       </w:pPr>
     </w:lvl>
   </w:abstractNum>
-  <w:abstractNum w:abstractNumId="24" w15:restartNumberingAfterBreak="0">
+  <w:abstractNum w:abstractNumId="28" w15:restartNumberingAfterBreak="0">
     <w:nsid w:val="76F60293"/>
     <w:multiLevelType w:val="multilevel"/>
     <w:tmpl w:val="F68CFE34"/>
@@ -10533,79 +12670,91 @@
     </w:lvl>
   </w:abstractNum>
   <w:num w:numId="1">
+    <w:abstractNumId w:val="1"/>
+  </w:num>
+  <w:num w:numId="2">
+    <w:abstractNumId w:val="7"/>
+  </w:num>
+  <w:num w:numId="3">
+    <w:abstractNumId w:val="2"/>
+  </w:num>
+  <w:num w:numId="4">
+    <w:abstractNumId w:val="19"/>
+  </w:num>
+  <w:num w:numId="5">
+    <w:abstractNumId w:val="11"/>
+  </w:num>
+  <w:num w:numId="6">
+    <w:abstractNumId w:val="25"/>
+  </w:num>
+  <w:num w:numId="7">
+    <w:abstractNumId w:val="6"/>
+  </w:num>
+  <w:num w:numId="8">
+    <w:abstractNumId w:val="5"/>
+  </w:num>
+  <w:num w:numId="9">
+    <w:abstractNumId w:val="18"/>
+  </w:num>
+  <w:num w:numId="10">
+    <w:abstractNumId w:val="22"/>
+  </w:num>
+  <w:num w:numId="11">
+    <w:abstractNumId w:val="10"/>
+  </w:num>
+  <w:num w:numId="12">
+    <w:abstractNumId w:val="3"/>
+  </w:num>
+  <w:num w:numId="13">
+    <w:abstractNumId w:val="4"/>
+  </w:num>
+  <w:num w:numId="14">
+    <w:abstractNumId w:val="21"/>
+  </w:num>
+  <w:num w:numId="15">
+    <w:abstractNumId w:val="13"/>
+  </w:num>
+  <w:num w:numId="16">
+    <w:abstractNumId w:val="16"/>
+  </w:num>
+  <w:num w:numId="17">
+    <w:abstractNumId w:val="9"/>
+  </w:num>
+  <w:num w:numId="18">
+    <w:abstractNumId w:val="20"/>
+  </w:num>
+  <w:num w:numId="19">
+    <w:abstractNumId w:val="15"/>
+  </w:num>
+  <w:num w:numId="20">
+    <w:abstractNumId w:val="17"/>
+  </w:num>
+  <w:num w:numId="21">
+    <w:abstractNumId w:val="26"/>
+  </w:num>
+  <w:num w:numId="22">
+    <w:abstractNumId w:val="28"/>
+  </w:num>
+  <w:num w:numId="23">
+    <w:abstractNumId w:val="14"/>
+  </w:num>
+  <w:num w:numId="24">
+    <w:abstractNumId w:val="27"/>
+  </w:num>
+  <w:num w:numId="25">
+    <w:abstractNumId w:val="8"/>
+  </w:num>
+  <w:num w:numId="26">
+    <w:abstractNumId w:val="24"/>
+  </w:num>
+  <w:num w:numId="27">
     <w:abstractNumId w:val="0"/>
   </w:num>
-  <w:num w:numId="2">
-    <w:abstractNumId w:val="6"/>
-  </w:num>
-  <w:num w:numId="3">
-    <w:abstractNumId w:val="1"/>
-  </w:num>
-  <w:num w:numId="4">
-    <w:abstractNumId w:val="17"/>
-  </w:num>
-  <w:num w:numId="5">
-    <w:abstractNumId w:val="10"/>
-  </w:num>
-  <w:num w:numId="6">
-    <w:abstractNumId w:val="21"/>
-  </w:num>
-  <w:num w:numId="7">
-    <w:abstractNumId w:val="5"/>
-  </w:num>
-  <w:num w:numId="8">
-    <w:abstractNumId w:val="4"/>
-  </w:num>
-  <w:num w:numId="9">
-    <w:abstractNumId w:val="16"/>
-  </w:num>
-  <w:num w:numId="10">
-    <w:abstractNumId w:val="20"/>
-  </w:num>
-  <w:num w:numId="11">
-    <w:abstractNumId w:val="9"/>
-  </w:num>
-  <w:num w:numId="12">
-    <w:abstractNumId w:val="2"/>
-  </w:num>
-  <w:num w:numId="13">
-    <w:abstractNumId w:val="3"/>
-  </w:num>
-  <w:num w:numId="14">
-    <w:abstractNumId w:val="19"/>
-  </w:num>
-  <w:num w:numId="15">
-    <w:abstractNumId w:val="11"/>
-  </w:num>
-  <w:num w:numId="16">
-    <w:abstractNumId w:val="14"/>
-  </w:num>
-  <w:num w:numId="17">
-    <w:abstractNumId w:val="8"/>
-  </w:num>
-  <w:num w:numId="18">
-    <w:abstractNumId w:val="18"/>
-  </w:num>
-  <w:num w:numId="19">
-    <w:abstractNumId w:val="13"/>
-  </w:num>
-  <w:num w:numId="20">
-    <w:abstractNumId w:val="15"/>
-  </w:num>
-  <w:num w:numId="21">
-    <w:abstractNumId w:val="22"/>
-  </w:num>
-  <w:num w:numId="22">
-    <w:abstractNumId w:val="24"/>
-  </w:num>
-  <w:num w:numId="23">
+  <w:num w:numId="28">
     <w:abstractNumId w:val="12"/>
   </w:num>
-  <w:num w:numId="24">
+  <w:num w:numId="29">
     <w:abstractNumId w:val="23"/>
-  </w:num>
-  <w:num w:numId="25">
-    <w:abstractNumId w:val="7"/>
   </w:num>
 </w:numbering>
 </file>
@@ -11079,6 +13228,7 @@
   <w:style w:type="character" w:default="1" w:styleId="a0">
     <w:name w:val="Default Paragraph Font"/>
     <w:uiPriority w:val="1"/>
+    <w:semiHidden/>
     <w:unhideWhenUsed/>
   </w:style>
   <w:style w:type="table" w:default="1" w:styleId="a1">
@@ -11135,8 +13285,8 @@
   <w:style w:type="paragraph" w:styleId="a5">
     <w:name w:val="Normal (Web)"/>
     <w:basedOn w:val="a"/>
+    <w:link w:val="a6"/>
     <w:uiPriority w:val="99"/>
-    <w:semiHidden/>
     <w:unhideWhenUsed/>
     <w:rsid w:val="001336E8"/>
     <w:pPr>
@@ -11149,7 +13299,7 @@
       <w:lang w:val="ru-RU" w:eastAsia="ru-RU"/>
     </w:rPr>
   </w:style>
-  <w:style w:type="character" w:styleId="a6">
+  <w:style w:type="character" w:styleId="a7">
     <w:name w:val="Strong"/>
     <w:basedOn w:val="a0"/>
     <w:uiPriority w:val="22"/>
@@ -11195,7 +13345,6 @@
     <w:basedOn w:val="a"/>
     <w:link w:val="HTML0"/>
     <w:uiPriority w:val="99"/>
-    <w:semiHidden/>
     <w:unhideWhenUsed/>
     <w:rsid w:val="00F9166A"/>
     <w:pPr>
@@ -11231,7 +13380,6 @@
     <w:basedOn w:val="a0"/>
     <w:link w:val="HTML"/>
     <w:uiPriority w:val="99"/>
-    <w:semiHidden/>
     <w:rsid w:val="00F9166A"/>
     <w:rPr>
       <w:rFonts w:ascii="Courier New" w:eastAsia="Times New Roman" w:hAnsi="Courier New" w:cs="Courier New"/>
@@ -11302,7 +13450,7 @@
     <w:basedOn w:val="a0"/>
     <w:rsid w:val="00F9166A"/>
   </w:style>
-  <w:style w:type="character" w:styleId="a7">
+  <w:style w:type="character" w:styleId="a8">
     <w:name w:val="Emphasis"/>
     <w:basedOn w:val="a0"/>
     <w:uiPriority w:val="20"/>
@@ -11313,7 +13461,7 @@
       <w:iCs/>
     </w:rPr>
   </w:style>
-  <w:style w:type="character" w:styleId="a8">
+  <w:style w:type="character" w:styleId="a9">
     <w:name w:val="Hyperlink"/>
     <w:basedOn w:val="a0"/>
     <w:uiPriority w:val="99"/>
@@ -11323,6 +13471,76 @@
     <w:rPr>
       <w:color w:val="0000FF"/>
       <w:u w:val="single"/>
+    </w:rPr>
+  </w:style>
+  <w:style w:type="paragraph" w:customStyle="1" w:styleId="Code">
+    <w:name w:val="Code"/>
+    <w:basedOn w:val="a5"/>
+    <w:link w:val="Code0"/>
+    <w:qFormat/>
+    <w:rsid w:val="009A6F61"/>
+    <w:rPr>
+      <w:lang w:val="en-US"/>
+    </w:rPr>
+  </w:style>
+  <w:style w:type="paragraph" w:styleId="aa">
+    <w:name w:val="Intense Quote"/>
+    <w:basedOn w:val="a"/>
+    <w:next w:val="a"/>
+    <w:link w:val="ab"/>
+    <w:uiPriority w:val="30"/>
+    <w:qFormat/>
+    <w:rsid w:val="009A6F61"/>
+    <w:pPr>
+      <w:pBdr>
+        <w:top w:val="single" w:sz="4" w:space="10" w:color="5B9BD5" w:themeColor="accent1"/>
+        <w:bottom w:val="single" w:sz="4" w:space="10" w:color="5B9BD5" w:themeColor="accent1"/>
+      </w:pBdr>
+      <w:spacing w:before="360" w:after="360"/>
+      <w:ind w:left="864" w:right="864"/>
+      <w:jc w:val="center"/>
+    </w:pPr>
+    <w:rPr>
+      <w:i/>
+      <w:iCs/>
+      <w:color w:val="5B9BD5" w:themeColor="accent1"/>
+    </w:rPr>
+  </w:style>
+  <w:style w:type="character" w:customStyle="1" w:styleId="a6">
+    <w:name w:val="Обычный (Интернет) Знак"/>
+    <w:basedOn w:val="a0"/>
+    <w:link w:val="a5"/>
+    <w:uiPriority w:val="99"/>
+    <w:rsid w:val="009A6F61"/>
+    <w:rPr>
+      <w:rFonts w:ascii="Times New Roman" w:eastAsia="Times New Roman" w:hAnsi="Times New Roman" w:cs="Times New Roman"/>
+      <w:sz w:val="24"/>
+      <w:szCs w:val="24"/>
+      <w:lang w:val="ru-RU" w:eastAsia="ru-RU"/>
+    </w:rPr>
+  </w:style>
+  <w:style w:type="character" w:customStyle="1" w:styleId="Code0">
+    <w:name w:val="Code Знак"/>
+    <w:basedOn w:val="a6"/>
+    <w:link w:val="Code"/>
+    <w:rsid w:val="009A6F61"/>
+    <w:rPr>
+      <w:rFonts w:ascii="Times New Roman" w:eastAsia="Times New Roman" w:hAnsi="Times New Roman" w:cs="Times New Roman"/>
+      <w:sz w:val="24"/>
+      <w:szCs w:val="24"/>
+      <w:lang w:val="ru-RU" w:eastAsia="ru-RU"/>
+    </w:rPr>
+  </w:style>
+  <w:style w:type="character" w:customStyle="1" w:styleId="ab">
+    <w:name w:val="Выделенная цитата Знак"/>
+    <w:basedOn w:val="a0"/>
+    <w:link w:val="aa"/>
+    <w:uiPriority w:val="30"/>
+    <w:rsid w:val="009A6F61"/>
+    <w:rPr>
+      <w:i/>
+      <w:iCs/>
+      <w:color w:val="5B9BD5" w:themeColor="accent1"/>
     </w:rPr>
   </w:style>
 </w:styles>

</xml_diff>